<commit_message>
docs: อัป Proposal draft 13, รูปบท 5 และ research notes
เพิ่ม draft 13, รูป ch5_final, ย้าย cite supporting และโน้ต gas mixing

Co-authored-by: Cursor <cursoragent@cursor.com>
</commit_message>
<xml_diff>
--- a/docs/draft/Proposal draft 12.1.docx
+++ b/docs/draft/Proposal draft 12.1.docx
@@ -965,7 +965,6 @@
           <w:rFonts w:hint="cs"/>
           <w:cs/>
         </w:rPr>
-        <w:lastRenderedPageBreak/>
         <w:t>วิทยานิพนธ์นี้จึงมีวัตถุประสงค์เพื่อพัฒนาและประยุกต์ใช้จมูกเล็กทรอนิกส์ในการประเมินความเข้มข้นของก๊าซมีเทนในแปลงนาข้าว</w:t>
       </w:r>
     </w:p>
@@ -1035,46 +1034,40 @@
         <w:rPr>
           <w:cs/>
         </w:rPr>
-        <w:t xml:space="preserve">การปล่อยก๊าซมีเทนจากนาข้าวน้ำขัง</w:t>
-      </w:r>
-    </w:p>
-    <w:p>
-      <w:pPr>
-        <w:pStyle w:val="List Paragraph"/>
+        <w:t>การปล่อยก๊าซมีเทนจากนาข้าวน้ำขัง</w:t>
+      </w:r>
+    </w:p>
+    <w:p>
+      <w:pPr>
         <w:numPr>
           <w:ilvl w:val="3"/>
           <w:numId w:val="18"/>
         </w:numPr>
       </w:pPr>
       <w:r>
-        <w:rPr/>
-        <w:t xml:space="preserve">เส้นทางปล่อยสู่บรรยากาศ</w:t>
-      </w:r>
-    </w:p>
-    <w:p>
-      <w:pPr>
-        <w:pStyle w:val="List Paragraph"/>
+        <w:t>เส้นทางปล่อยสู่บรรยากาศ</w:t>
+      </w:r>
+    </w:p>
+    <w:p>
+      <w:pPr>
         <w:numPr>
           <w:ilvl w:val="3"/>
           <w:numId w:val="17"/>
         </w:numPr>
       </w:pPr>
       <w:r>
-        <w:rPr/>
-        <w:t xml:space="preserve">ปัจจัยควบคุมฟลักซ์ในระดับแปลง</w:t>
-      </w:r>
-    </w:p>
-    <w:p>
-      <w:pPr>
-        <w:pStyle w:val="List Paragraph"/>
+        <w:t>ปัจจัยควบคุมฟลักซ์ในระดับแปลง</w:t>
+      </w:r>
+    </w:p>
+    <w:p>
+      <w:pPr>
         <w:numPr>
           <w:ilvl w:val="3"/>
           <w:numId w:val="16"/>
         </w:numPr>
       </w:pPr>
       <w:r>
-        <w:rPr/>
-        <w:t xml:space="preserve">ความแปรผันเชิงพื้นที่ภายในแปลงนา</w:t>
+        <w:t>ความแปรผันเชิงพื้นที่ภายในแปลงนา</w:t>
       </w:r>
     </w:p>
     <w:p>
@@ -1094,7 +1087,8 @@
         <w:rPr>
           <w:cs/>
         </w:rPr>
-        <w:t xml:space="preserve">การวัดก๊าซมีเทนในระดับแปลงนา</w:t>
+        <w:lastRenderedPageBreak/>
+        <w:t>การวัดก๊าซมีเทนในระดับแปลงนา</w:t>
       </w:r>
     </w:p>
     <w:p>
@@ -1116,7 +1110,7 @@
           <w:b/>
           <w:cs/>
         </w:rPr>
-        <w:t xml:space="preserve">ห้องเก็บตัวอย่างแบบปิดร่วมกับแก๊สโครมาโทกราฟี</w:t>
+        <w:t>ห้องเก็บตัวอย่างแบบปิดร่วมกับแก๊สโครมาโทกราฟี</w:t>
       </w:r>
     </w:p>
     <w:p>
@@ -1138,20 +1132,18 @@
           <w:b/>
           <w:cs/>
         </w:rPr>
-        <w:t xml:space="preserve">เครื่องวิเคราะห์ก๊าซความแม่นยำสูงในสนาม</w:t>
-      </w:r>
-    </w:p>
-    <w:p>
-      <w:pPr>
-        <w:pStyle w:val="List Paragraph"/>
+        <w:t>เครื่องวิเคราะห์ก๊าซความแม่นยำสูงในสนาม</w:t>
+      </w:r>
+    </w:p>
+    <w:p>
+      <w:pPr>
         <w:numPr>
           <w:ilvl w:val="3"/>
           <w:numId w:val="19"/>
         </w:numPr>
       </w:pPr>
       <w:r>
-        <w:rPr/>
-        <w:t xml:space="preserve">การวัดแบบเอดดี้โคเวอเรียนซ์</w:t>
+        <w:t>การวัดแบบเอดดี้โคเวอเรียนซ์</w:t>
       </w:r>
     </w:p>
     <w:p>
@@ -1173,7 +1165,7 @@
           <w:b/>
           <w:cs/>
         </w:rPr>
-        <w:t xml:space="preserve">การประเมินการปล่อยก๊าซมีเทนระดับภูมิภาค</w:t>
+        <w:t>การประเมินการปล่อยก๊าซมีเทนระดับภูมิภาค</w:t>
       </w:r>
     </w:p>
     <w:p>
@@ -1195,14 +1187,8 @@
           <w:b/>
           <w:cs/>
         </w:rPr>
-        <w:t xml:space="preserve">การตรวจวัดจากดาวเทียม</w:t>
-      </w:r>
-      <w:proofErr w:type="spellStart"/>
-      <w:proofErr w:type="spellEnd"/>
-      <w:proofErr w:type="spellStart"/>
-      <w:proofErr w:type="spellEnd"/>
-      <w:proofErr w:type="spellStart"/>
-      <w:proofErr w:type="spellEnd"/>
+        <w:t>การตรวจวัดจากดาวเทียม</w:t>
+      </w:r>
     </w:p>
     <w:p>
       <w:pPr>
@@ -1217,20 +1203,17 @@
           <w:b/>
         </w:rPr>
       </w:pPr>
-      <w:proofErr w:type="spellStart"/>
       <w:r>
         <w:rPr>
           <w:rFonts w:hint="cs"/>
           <w:b/>
           <w:cs/>
         </w:rPr>
-        <w:t xml:space="preserve">แบบจำลองกระบวนการและบัญชีการปล่อย</w:t>
-      </w:r>
-      <w:proofErr w:type="spellEnd"/>
-    </w:p>
-    <w:p>
-      <w:pPr>
-        <w:pStyle w:val="List Paragraph"/>
+        <w:t>แบบจำลองกระบวนการและบัญชีการปล่อย</w:t>
+      </w:r>
+    </w:p>
+    <w:p>
+      <w:pPr>
         <w:numPr>
           <w:ilvl w:val="2"/>
           <w:numId w:val="1"/>
@@ -1240,51 +1223,44 @@
         <w:rPr>
           <w:b/>
         </w:rPr>
-        <w:t xml:space="preserve">การตรวจวัดก๊าซมีเทนด้วยจมูกอิเล็กทรอนิกส์และเซ็นเซอร์โลหะออกไซด์</w:t>
-      </w:r>
-    </w:p>
-    <w:p>
-      <w:pPr>
-        <w:pStyle w:val="List Paragraph"/>
+        <w:t>การตรวจวัดก๊าซมีเทนด้วยจมูกอิเล็กทรอนิกส์และเซ็นเซอร์โลหะออกไซด์</w:t>
+      </w:r>
+    </w:p>
+    <w:p>
+      <w:pPr>
         <w:numPr>
           <w:ilvl w:val="3"/>
           <w:numId w:val="23"/>
         </w:numPr>
       </w:pPr>
       <w:r>
-        <w:rPr/>
-        <w:t xml:space="preserve">การประยุกต์ในนาข้าว</w:t>
-      </w:r>
-    </w:p>
-    <w:p>
-      <w:pPr>
-        <w:pStyle w:val="List Paragraph"/>
+        <w:t>การประยุกต์ในนาข้าว</w:t>
+      </w:r>
+    </w:p>
+    <w:p>
+      <w:pPr>
         <w:numPr>
           <w:ilvl w:val="3"/>
           <w:numId w:val="22"/>
         </w:numPr>
       </w:pPr>
       <w:r>
-        <w:rPr/>
-        <w:t xml:space="preserve">การประยุกต์นอกแปลงนา</w:t>
-      </w:r>
-    </w:p>
-    <w:p>
-      <w:pPr>
-        <w:pStyle w:val="List Paragraph"/>
+        <w:t>การประยุกต์นอกแปลงนา</w:t>
+      </w:r>
+    </w:p>
+    <w:p>
+      <w:pPr>
         <w:numPr>
           <w:ilvl w:val="3"/>
           <w:numId w:val="21"/>
         </w:numPr>
       </w:pPr>
       <w:r>
-        <w:rPr/>
-        <w:t xml:space="preserve">ผลของอุณหภูมิและความชื้นที่รายงานในงานทดลอง</w:t>
-      </w:r>
-    </w:p>
-    <w:p>
-      <w:pPr>
-        <w:pStyle w:val="List Paragraph"/>
+        <w:t>ผลของอุณหภูมิและความชื้นที่รายงานในงานทดลอง</w:t>
+      </w:r>
+    </w:p>
+    <w:p>
+      <w:pPr>
         <w:numPr>
           <w:ilvl w:val="2"/>
           <w:numId w:val="1"/>
@@ -1294,33 +1270,29 @@
         <w:rPr>
           <w:b/>
         </w:rPr>
-        <w:t xml:space="preserve">การสอบเทียบความเข้มข้นก๊าซมีเทนด้วยการเรียนรู้แบบมีผู้สอน</w:t>
-      </w:r>
-    </w:p>
-    <w:p>
-      <w:pPr>
-        <w:pStyle w:val="List Paragraph"/>
+        <w:t>การสอบเทียบความเข้มข้นก๊าซมีเทนด้วยการเรียนรู้แบบมีผู้สอน</w:t>
+      </w:r>
+    </w:p>
+    <w:p>
+      <w:pPr>
         <w:numPr>
           <w:ilvl w:val="3"/>
           <w:numId w:val="26"/>
         </w:numPr>
       </w:pPr>
       <w:r>
-        <w:rPr/>
-        <w:t xml:space="preserve">แบบจำลองถดถอยเทียบค่าอ้างอิง</w:t>
-      </w:r>
-    </w:p>
-    <w:p>
-      <w:pPr>
-        <w:pStyle w:val="List Paragraph"/>
+        <w:t>แบบจำลองถดถอยเทียบค่าอ้างอิง</w:t>
+      </w:r>
+    </w:p>
+    <w:p>
+      <w:pPr>
         <w:numPr>
           <w:ilvl w:val="3"/>
           <w:numId w:val="25"/>
         </w:numPr>
       </w:pPr>
       <w:r>
-        <w:rPr/>
-        <w:t xml:space="preserve">ช่วงความเข้มข้นและตัวแปรสภาพแวดล้อมที่ใช้ฝึก</w:t>
+        <w:t>ช่วงความเข้มข้นและตัวแปรสภาพแวดล้อมที่ใช้ฝึก</w:t>
       </w:r>
     </w:p>
     <w:p>
@@ -1648,6 +1620,7 @@
         <w:rPr>
           <w:cs/>
         </w:rPr>
+        <w:lastRenderedPageBreak/>
         <w:t>ได้ข้อมูลและแบบจำลองสำหรับประมาณความเข้มข้นก๊าซมีเทน ภายในช่วงความเข้มข้นและอุณหภูมิที่ใช้ฝึกแบบจำลอง</w:t>
       </w:r>
     </w:p>
@@ -1795,9 +1768,33 @@
       </w:pPr>
       <w:r>
         <w:rPr>
-          <w:color w:val="000000"/>
-        </w:rPr>
-        <w:t>การวิเคราะห์ก๊าซละลายในน้ำ</w:t>
+          <w:cs/>
+        </w:rPr>
+        <w:t>กล่องเก็บตัวอย่างแบบพลวัต (</w:t>
+      </w:r>
+      <w:proofErr w:type="spellStart"/>
+      <w:r>
+        <w:t>Dynamic</w:t>
+      </w:r>
+      <w:proofErr w:type="spellEnd"/>
+      <w:r>
+        <w:t xml:space="preserve"> </w:t>
+      </w:r>
+      <w:proofErr w:type="spellStart"/>
+      <w:r>
+        <w:t>Flux</w:t>
+      </w:r>
+      <w:proofErr w:type="spellEnd"/>
+      <w:r>
+        <w:t xml:space="preserve"> </w:t>
+      </w:r>
+      <w:proofErr w:type="spellStart"/>
+      <w:r>
+        <w:t>Chamber</w:t>
+      </w:r>
+      <w:proofErr w:type="spellEnd"/>
+      <w:r>
+        <w:t>)</w:t>
       </w:r>
     </w:p>
     <w:p>
@@ -1811,10 +1808,90 @@
       </w:pPr>
       <w:r>
         <w:rPr>
+          <w:color w:val="000000"/>
+        </w:rPr>
+        <w:t>การวิเคราะห์ก๊าซละลายในน้ำ</w:t>
+      </w:r>
+      <w:r>
+        <w:rPr>
           <w:rFonts w:hint="cs"/>
           <w:cs/>
-        </w:rPr>
-        <w:t>...</w:t>
+          <w:lang w:val="en-US"/>
+        </w:rPr>
+        <w:t xml:space="preserve"> </w:t>
+      </w:r>
+      <w:r>
+        <w:rPr>
+          <w:lang w:val="en-US"/>
+        </w:rPr>
+        <w:t>(</w:t>
+      </w:r>
+      <w:proofErr w:type="spellStart"/>
+      <w:r>
+        <w:t>Dissolved</w:t>
+      </w:r>
+      <w:proofErr w:type="spellEnd"/>
+      <w:r>
+        <w:t xml:space="preserve"> </w:t>
+      </w:r>
+      <w:proofErr w:type="spellStart"/>
+      <w:r>
+        <w:t>Methane</w:t>
+      </w:r>
+      <w:proofErr w:type="spellEnd"/>
+      <w:r>
+        <w:t xml:space="preserve"> </w:t>
+      </w:r>
+      <w:proofErr w:type="spellStart"/>
+      <w:r>
+        <w:t>Analysis</w:t>
+      </w:r>
+      <w:proofErr w:type="spellEnd"/>
+      <w:r>
+        <w:rPr>
+          <w:lang w:val="en-US"/>
+        </w:rPr>
+        <w:t>)</w:t>
+      </w:r>
+    </w:p>
+    <w:p>
+      <w:pPr>
+        <w:numPr>
+          <w:ilvl w:val="2"/>
+          <w:numId w:val="5"/>
+        </w:numPr>
+        <w:spacing w:before="40"/>
+        <w:ind w:left="1080"/>
+      </w:pPr>
+      <w:r>
+        <w:rPr>
+          <w:cs/>
+        </w:rPr>
+        <w:t>การติดตามด้วยไอโซโทปเสถียร (</w:t>
+      </w:r>
+      <w:proofErr w:type="spellStart"/>
+      <w:r>
+        <w:t>Stable</w:t>
+      </w:r>
+      <w:proofErr w:type="spellEnd"/>
+      <w:r>
+        <w:t xml:space="preserve"> </w:t>
+      </w:r>
+      <w:proofErr w:type="spellStart"/>
+      <w:r>
+        <w:t>Isotope</w:t>
+      </w:r>
+      <w:proofErr w:type="spellEnd"/>
+      <w:r>
+        <w:t xml:space="preserve"> </w:t>
+      </w:r>
+      <w:proofErr w:type="spellStart"/>
+      <w:r>
+        <w:t>Tracing</w:t>
+      </w:r>
+      <w:proofErr w:type="spellEnd"/>
+      <w:r>
+        <w:t>)</w:t>
       </w:r>
     </w:p>
     <w:p>
@@ -1902,10 +1979,87 @@
       </w:pPr>
       <w:r>
         <w:rPr>
-          <w:rFonts w:hint="cs"/>
-          <w:cs/>
-        </w:rPr>
-        <w:t>...</w:t>
+          <w:cs/>
+        </w:rPr>
+        <w:t>วิธีการไล่ระดับฟลัก</w:t>
+      </w:r>
+      <w:proofErr w:type="spellStart"/>
+      <w:r>
+        <w:rPr>
+          <w:cs/>
+        </w:rPr>
+        <w:t>ซ์</w:t>
+      </w:r>
+      <w:proofErr w:type="spellEnd"/>
+      <w:r>
+        <w:rPr>
+          <w:cs/>
+        </w:rPr>
+        <w:t xml:space="preserve"> (</w:t>
+      </w:r>
+      <w:proofErr w:type="spellStart"/>
+      <w:r>
+        <w:t>Flux</w:t>
+      </w:r>
+      <w:proofErr w:type="spellEnd"/>
+      <w:r>
+        <w:t xml:space="preserve"> </w:t>
+      </w:r>
+      <w:proofErr w:type="spellStart"/>
+      <w:r>
+        <w:t>Gradient</w:t>
+      </w:r>
+      <w:proofErr w:type="spellEnd"/>
+      <w:r>
+        <w:t xml:space="preserve"> </w:t>
+      </w:r>
+      <w:proofErr w:type="spellStart"/>
+      <w:r>
+        <w:t>Method</w:t>
+      </w:r>
+      <w:proofErr w:type="spellEnd"/>
+      <w:r>
+        <w:t>)</w:t>
+      </w:r>
+    </w:p>
+    <w:p>
+      <w:pPr>
+        <w:numPr>
+          <w:ilvl w:val="2"/>
+          <w:numId w:val="5"/>
+        </w:numPr>
+        <w:spacing w:before="40"/>
+        <w:ind w:left="1080"/>
+      </w:pPr>
+      <w:r>
+        <w:rPr>
+          <w:cs/>
+        </w:rPr>
+        <w:t>สมดุลมวลสารแบบบูรณาการแนวนอน (</w:t>
+      </w:r>
+      <w:proofErr w:type="spellStart"/>
+      <w:r>
+        <w:t>Integrated</w:t>
+      </w:r>
+      <w:proofErr w:type="spellEnd"/>
+      <w:r>
+        <w:t xml:space="preserve"> </w:t>
+      </w:r>
+      <w:proofErr w:type="spellStart"/>
+      <w:r>
+        <w:t>Horizontal</w:t>
+      </w:r>
+      <w:proofErr w:type="spellEnd"/>
+      <w:r>
+        <w:t xml:space="preserve"> </w:t>
+      </w:r>
+      <w:proofErr w:type="spellStart"/>
+      <w:r>
+        <w:t>Flux</w:t>
+      </w:r>
+      <w:proofErr w:type="spellEnd"/>
+      <w:r>
+        <w:t>)</w:t>
       </w:r>
     </w:p>
     <w:p>
@@ -1934,10 +2088,125 @@
       </w:pPr>
       <w:r>
         <w:rPr>
-          <w:rFonts w:hint="cs"/>
-          <w:cs/>
-        </w:rPr>
-        <w:t>...</w:t>
+          <w:cs/>
+        </w:rPr>
+        <w:t>การรับรู้ระยะไกลผ่านดาวเทียม (</w:t>
+      </w:r>
+      <w:proofErr w:type="spellStart"/>
+      <w:r>
+        <w:t>Satellite</w:t>
+      </w:r>
+      <w:proofErr w:type="spellEnd"/>
+      <w:r>
+        <w:t xml:space="preserve"> </w:t>
+      </w:r>
+      <w:proofErr w:type="spellStart"/>
+      <w:r>
+        <w:t>Remote</w:t>
+      </w:r>
+      <w:proofErr w:type="spellEnd"/>
+      <w:r>
+        <w:t xml:space="preserve"> </w:t>
+      </w:r>
+      <w:proofErr w:type="spellStart"/>
+      <w:r>
+        <w:t>Sensing</w:t>
+      </w:r>
+      <w:proofErr w:type="spellEnd"/>
+      <w:r>
+        <w:t>)</w:t>
+      </w:r>
+    </w:p>
+    <w:p>
+      <w:pPr>
+        <w:numPr>
+          <w:ilvl w:val="2"/>
+          <w:numId w:val="5"/>
+        </w:numPr>
+        <w:spacing w:before="80"/>
+      </w:pPr>
+      <w:r>
+        <w:rPr>
+          <w:cs/>
+        </w:rPr>
+        <w:t>แบบจำลองบรรยากาศแบบย้อนกลับ (</w:t>
+      </w:r>
+      <w:proofErr w:type="spellStart"/>
+      <w:r>
+        <w:t>Atmospheric</w:t>
+      </w:r>
+      <w:proofErr w:type="spellEnd"/>
+      <w:r>
+        <w:t xml:space="preserve"> </w:t>
+      </w:r>
+      <w:proofErr w:type="spellStart"/>
+      <w:r>
+        <w:t>Inversion</w:t>
+      </w:r>
+      <w:proofErr w:type="spellEnd"/>
+      <w:r>
+        <w:t xml:space="preserve"> </w:t>
+      </w:r>
+      <w:proofErr w:type="spellStart"/>
+      <w:r>
+        <w:t>Models</w:t>
+      </w:r>
+      <w:proofErr w:type="spellEnd"/>
+      <w:r>
+        <w:t>)</w:t>
+      </w:r>
+    </w:p>
+    <w:p>
+      <w:pPr>
+        <w:numPr>
+          <w:ilvl w:val="2"/>
+          <w:numId w:val="5"/>
+        </w:numPr>
+        <w:spacing w:before="80"/>
+      </w:pPr>
+      <w:r>
+        <w:rPr>
+          <w:cs/>
+        </w:rPr>
+        <w:t>การสเกลอ</w:t>
+      </w:r>
+      <w:proofErr w:type="spellStart"/>
+      <w:r>
+        <w:rPr>
+          <w:cs/>
+        </w:rPr>
+        <w:t>ัป</w:t>
+      </w:r>
+      <w:proofErr w:type="spellEnd"/>
+      <w:r>
+        <w:rPr>
+          <w:cs/>
+        </w:rPr>
+        <w:t>ด้วยเครื่องจักรเรียนรู้ (</w:t>
+      </w:r>
+      <w:proofErr w:type="spellStart"/>
+      <w:r>
+        <w:t>Machine</w:t>
+      </w:r>
+      <w:proofErr w:type="spellEnd"/>
+      <w:r>
+        <w:t xml:space="preserve"> </w:t>
+      </w:r>
+      <w:proofErr w:type="spellStart"/>
+      <w:r>
+        <w:t>Learning</w:t>
+      </w:r>
+      <w:proofErr w:type="spellEnd"/>
+      <w:r>
+        <w:t xml:space="preserve"> </w:t>
+      </w:r>
+      <w:proofErr w:type="spellStart"/>
+      <w:r>
+        <w:t>Upscaling</w:t>
+      </w:r>
+      <w:proofErr w:type="spellEnd"/>
+      <w:r>
+        <w:t>)</w:t>
       </w:r>
     </w:p>
     <w:p>
@@ -1953,6 +2222,7 @@
           <w:b/>
           <w:color w:val="000000"/>
         </w:rPr>
+        <w:lastRenderedPageBreak/>
         <w:t>5.4 จมูกอิเล็กทรอนิกส์และเซ็นเซอร์ก๊าซ</w:t>
       </w:r>
     </w:p>
@@ -2156,7 +2426,6 @@
         <w:rPr>
           <w:color w:val="000000"/>
         </w:rPr>
-        <w:lastRenderedPageBreak/>
         <w:t>การแบ่งชุดข้อมูล</w:t>
       </w:r>
     </w:p>
@@ -2194,15 +2463,17 @@
     </w:p>
     <w:p>
       <w:pPr>
-        <w:numPr>
-          <w:ilvl w:val="0"/>
-          <w:numId w:val="11"/>
-        </w:numPr>
-        <w:spacing w:before="40" w:after="40"/>
-        <w:ind w:left="360" w:firstLine="0"/>
-      </w:pPr>
-      <w:r>
-        <w:rPr>
+        <w:keepNext/>
+        <w:spacing w:before="120" w:after="80"/>
+        <w:ind w:left="360"/>
+        <w:rPr>
+          <w:b/>
+          <w:color w:val="000000"/>
+        </w:rPr>
+      </w:pPr>
+      <w:r>
+        <w:rPr>
+          <w:b/>
           <w:color w:val="000000"/>
         </w:rPr>
         <w:t>5.5.4 การปรับแต่งโมเดลและการนำไปใช้งาน ตัวชี้วัดความใกล้เคียงกับค่าอ้างอิง: RMSE, MAE และ R²</w:t>
@@ -2678,7 +2949,7 @@
         </w:rPr>
         <w:t xml:space="preserve"> Research, 2026. [Online]. Available: </w:t>
       </w:r>
-      <w:hyperlink w:history="1" r:id="rId11">
+      <w:hyperlink r:id="rId11" w:history="1">
         <w:r>
           <w:rPr>
             <w:rStyle w:val="Hyperlink"/>
@@ -2803,7 +3074,21 @@
         <w:rPr>
           <w:lang w:val="en-US"/>
         </w:rPr>
-        <w:t xml:space="preserve">[5] P. Rajasekar and J. A. V. Selvi, "Sensing and Analysis of Greenhouse Gas Emissions from Rice Fields to the Near Field Atmosphere," </w:t>
+        <w:t>[5</w:t>
+      </w:r>
+      <w:proofErr w:type="gramStart"/>
+      <w:r>
+        <w:rPr>
+          <w:lang w:val="en-US"/>
+        </w:rPr>
+        <w:t>] P.</w:t>
+      </w:r>
+      <w:proofErr w:type="gramEnd"/>
+      <w:r>
+        <w:rPr>
+          <w:lang w:val="en-US"/>
+        </w:rPr>
+        <w:t xml:space="preserve"> Rajasekar and J. A. V. Selvi, "Sensing and Analysis of Greenhouse Gas Emissions from Rice Fields to the Near Field Atmosphere," </w:t>
       </w:r>
       <w:r>
         <w:rPr>
@@ -3264,7 +3549,21 @@
         <w:rPr>
           <w:lang w:val="en-US"/>
         </w:rPr>
-        <w:t>: 10.1016/j.heliyon.2023.e14696.</w:t>
+        <w:t xml:space="preserve">: </w:t>
+      </w:r>
+      <w:proofErr w:type="gramStart"/>
+      <w:r>
+        <w:rPr>
+          <w:lang w:val="en-US"/>
+        </w:rPr>
+        <w:t>10.1016/j.heliyon.2023.e</w:t>
+      </w:r>
+      <w:proofErr w:type="gramEnd"/>
+      <w:r>
+        <w:rPr>
+          <w:lang w:val="en-US"/>
+        </w:rPr>
+        <w:t>14696.</w:t>
       </w:r>
     </w:p>
     <w:p>
@@ -4270,7 +4569,21 @@
         <w:rPr>
           <w:lang w:val="en-US"/>
         </w:rPr>
-        <w:t>: 10.2480/agrmet.d-20-00029.</w:t>
+        <w:t>: 10.2480/</w:t>
+      </w:r>
+      <w:proofErr w:type="gramStart"/>
+      <w:r>
+        <w:rPr>
+          <w:lang w:val="en-US"/>
+        </w:rPr>
+        <w:t>agrmet.d</w:t>
+      </w:r>
+      <w:proofErr w:type="gramEnd"/>
+      <w:r>
+        <w:rPr>
+          <w:lang w:val="en-US"/>
+        </w:rPr>
+        <w:t>-20-00029.</w:t>
       </w:r>
     </w:p>
     <w:p>
@@ -4963,6 +5276,92 @@
     </w:lvl>
   </w:abstractNum>
   <w:abstractNum w:abstractNumId="3" w15:restartNumberingAfterBreak="0">
+    <w:nsid w:val="12CB2A57"/>
+    <w:multiLevelType w:val="hybridMultilevel"/>
+    <w:tmpl w:val="00540A84"/>
+    <w:lvl w:ilvl="0" w:tplc="B100F9AC">
+      <w:start w:val="1"/>
+      <w:numFmt w:val="bullet"/>
+      <w:lvlText w:val="•"/>
+      <w:lvlJc w:val="left"/>
+      <w:pPr>
+        <w:ind w:left="720" w:hanging="360"/>
+      </w:pPr>
+    </w:lvl>
+    <w:lvl w:ilvl="1" w:tplc="FD08CF22">
+      <w:start w:val="1"/>
+      <w:numFmt w:val="bullet"/>
+      <w:lvlText w:val="◦"/>
+      <w:lvlJc w:val="left"/>
+      <w:pPr>
+        <w:ind w:left="1440" w:hanging="360"/>
+      </w:pPr>
+    </w:lvl>
+    <w:lvl w:ilvl="2" w:tplc="C52A62D4">
+      <w:start w:val="1"/>
+      <w:numFmt w:val="bullet"/>
+      <w:lvlText w:val="▪"/>
+      <w:lvlJc w:val="left"/>
+      <w:pPr>
+        <w:ind w:left="2160" w:hanging="360"/>
+      </w:pPr>
+    </w:lvl>
+    <w:lvl w:ilvl="3" w:tplc="C33C7A06">
+      <w:start w:val="1"/>
+      <w:numFmt w:val="bullet"/>
+      <w:lvlText w:val="•"/>
+      <w:lvlJc w:val="left"/>
+      <w:pPr>
+        <w:ind w:left="2880" w:hanging="360"/>
+      </w:pPr>
+    </w:lvl>
+    <w:lvl w:ilvl="4" w:tplc="D2FA5050">
+      <w:start w:val="1"/>
+      <w:numFmt w:val="bullet"/>
+      <w:lvlText w:val="◦"/>
+      <w:lvlJc w:val="left"/>
+      <w:pPr>
+        <w:ind w:left="3600" w:hanging="360"/>
+      </w:pPr>
+    </w:lvl>
+    <w:lvl w:ilvl="5" w:tplc="7C9251C8">
+      <w:start w:val="1"/>
+      <w:numFmt w:val="bullet"/>
+      <w:lvlText w:val="▪"/>
+      <w:lvlJc w:val="left"/>
+      <w:pPr>
+        <w:ind w:left="4320" w:hanging="360"/>
+      </w:pPr>
+    </w:lvl>
+    <w:lvl w:ilvl="6" w:tplc="F7D07AA2">
+      <w:start w:val="1"/>
+      <w:numFmt w:val="bullet"/>
+      <w:lvlText w:val="•"/>
+      <w:lvlJc w:val="left"/>
+      <w:pPr>
+        <w:ind w:left="5040" w:hanging="360"/>
+      </w:pPr>
+    </w:lvl>
+    <w:lvl w:ilvl="7" w:tplc="230ABF36">
+      <w:start w:val="1"/>
+      <w:numFmt w:val="bullet"/>
+      <w:lvlText w:val="◦"/>
+      <w:lvlJc w:val="left"/>
+      <w:pPr>
+        <w:ind w:left="5760" w:hanging="360"/>
+      </w:pPr>
+    </w:lvl>
+    <w:lvl w:ilvl="8" w:tplc="19CE79D2">
+      <w:start w:val="1"/>
+      <w:numFmt w:val="bullet"/>
+      <w:lvlText w:val="▪"/>
+      <w:lvlJc w:val="left"/>
+      <w:pPr>
+        <w:ind w:left="6480" w:hanging="360"/>
+      </w:pPr>
+    </w:lvl>
+  </w:abstractNum>
+  <w:abstractNum w:abstractNumId="4" w15:restartNumberingAfterBreak="0">
     <w:nsid w:val="2B7157C9"/>
     <w:multiLevelType w:val="hybridMultilevel"/>
     <w:tmpl w:val="140A3BC0"/>
@@ -5048,7 +5447,265 @@
       </w:pPr>
     </w:lvl>
   </w:abstractNum>
-  <w:abstractNum w:abstractNumId="4" w15:restartNumberingAfterBreak="0">
+  <w:abstractNum w:abstractNumId="5" w15:restartNumberingAfterBreak="0">
+    <w:nsid w:val="2B8D68E4"/>
+    <w:multiLevelType w:val="hybridMultilevel"/>
+    <w:tmpl w:val="8078EAA6"/>
+    <w:lvl w:ilvl="0" w:tplc="83E2E012">
+      <w:start w:val="1"/>
+      <w:numFmt w:val="bullet"/>
+      <w:lvlText w:val="•"/>
+      <w:lvlJc w:val="left"/>
+      <w:pPr>
+        <w:ind w:left="720" w:hanging="360"/>
+      </w:pPr>
+    </w:lvl>
+    <w:lvl w:ilvl="1" w:tplc="BE20870A">
+      <w:start w:val="1"/>
+      <w:numFmt w:val="bullet"/>
+      <w:lvlText w:val="◦"/>
+      <w:lvlJc w:val="left"/>
+      <w:pPr>
+        <w:ind w:left="1440" w:hanging="360"/>
+      </w:pPr>
+    </w:lvl>
+    <w:lvl w:ilvl="2" w:tplc="28D4A5C0">
+      <w:start w:val="1"/>
+      <w:numFmt w:val="bullet"/>
+      <w:lvlText w:val="▪"/>
+      <w:lvlJc w:val="left"/>
+      <w:pPr>
+        <w:ind w:left="2160" w:hanging="360"/>
+      </w:pPr>
+    </w:lvl>
+    <w:lvl w:ilvl="3" w:tplc="505C4BE8">
+      <w:start w:val="1"/>
+      <w:numFmt w:val="bullet"/>
+      <w:lvlText w:val="•"/>
+      <w:lvlJc w:val="left"/>
+      <w:pPr>
+        <w:ind w:left="2880" w:hanging="360"/>
+      </w:pPr>
+    </w:lvl>
+    <w:lvl w:ilvl="4" w:tplc="697E7B3A">
+      <w:start w:val="1"/>
+      <w:numFmt w:val="bullet"/>
+      <w:lvlText w:val="◦"/>
+      <w:lvlJc w:val="left"/>
+      <w:pPr>
+        <w:ind w:left="3600" w:hanging="360"/>
+      </w:pPr>
+    </w:lvl>
+    <w:lvl w:ilvl="5" w:tplc="C87E37B8">
+      <w:start w:val="1"/>
+      <w:numFmt w:val="bullet"/>
+      <w:lvlText w:val="▪"/>
+      <w:lvlJc w:val="left"/>
+      <w:pPr>
+        <w:ind w:left="4320" w:hanging="360"/>
+      </w:pPr>
+    </w:lvl>
+    <w:lvl w:ilvl="6" w:tplc="F6444830">
+      <w:start w:val="1"/>
+      <w:numFmt w:val="bullet"/>
+      <w:lvlText w:val="•"/>
+      <w:lvlJc w:val="left"/>
+      <w:pPr>
+        <w:ind w:left="5040" w:hanging="360"/>
+      </w:pPr>
+    </w:lvl>
+    <w:lvl w:ilvl="7" w:tplc="E77C1B86">
+      <w:start w:val="1"/>
+      <w:numFmt w:val="bullet"/>
+      <w:lvlText w:val="◦"/>
+      <w:lvlJc w:val="left"/>
+      <w:pPr>
+        <w:ind w:left="5760" w:hanging="360"/>
+      </w:pPr>
+    </w:lvl>
+    <w:lvl w:ilvl="8" w:tplc="6A90A50C">
+      <w:start w:val="1"/>
+      <w:numFmt w:val="bullet"/>
+      <w:lvlText w:val="▪"/>
+      <w:lvlJc w:val="left"/>
+      <w:pPr>
+        <w:ind w:left="6480" w:hanging="360"/>
+      </w:pPr>
+    </w:lvl>
+  </w:abstractNum>
+  <w:abstractNum w:abstractNumId="6" w15:restartNumberingAfterBreak="0">
+    <w:nsid w:val="304915FE"/>
+    <w:multiLevelType w:val="hybridMultilevel"/>
+    <w:tmpl w:val="C616F324"/>
+    <w:lvl w:ilvl="0" w:tplc="60D894A2">
+      <w:start w:val="1"/>
+      <w:numFmt w:val="decimal"/>
+      <w:lvlText w:val="%1."/>
+      <w:lvlJc w:val="left"/>
+      <w:pPr>
+        <w:ind w:left="720" w:hanging="360"/>
+      </w:pPr>
+    </w:lvl>
+    <w:lvl w:ilvl="1" w:tplc="B0928332">
+      <w:start w:val="1"/>
+      <w:numFmt w:val="lowerLetter"/>
+      <w:lvlText w:val="%2."/>
+      <w:lvlJc w:val="left"/>
+      <w:pPr>
+        <w:ind w:left="1440" w:hanging="360"/>
+      </w:pPr>
+    </w:lvl>
+    <w:lvl w:ilvl="2" w:tplc="A3A46408">
+      <w:start w:val="1"/>
+      <w:numFmt w:val="lowerRoman"/>
+      <w:lvlText w:val="%3."/>
+      <w:lvlJc w:val="left"/>
+      <w:pPr>
+        <w:ind w:left="2160" w:hanging="360"/>
+      </w:pPr>
+    </w:lvl>
+    <w:lvl w:ilvl="3" w:tplc="2044254E">
+      <w:start w:val="1"/>
+      <w:numFmt w:val="decimal"/>
+      <w:lvlText w:val="%4."/>
+      <w:lvlJc w:val="left"/>
+      <w:pPr>
+        <w:ind w:left="2880" w:hanging="360"/>
+      </w:pPr>
+    </w:lvl>
+    <w:lvl w:ilvl="4" w:tplc="6D026F96">
+      <w:start w:val="1"/>
+      <w:numFmt w:val="lowerLetter"/>
+      <w:lvlText w:val="%5."/>
+      <w:lvlJc w:val="left"/>
+      <w:pPr>
+        <w:ind w:left="3600" w:hanging="360"/>
+      </w:pPr>
+    </w:lvl>
+    <w:lvl w:ilvl="5" w:tplc="5A529304">
+      <w:start w:val="1"/>
+      <w:numFmt w:val="lowerRoman"/>
+      <w:lvlText w:val="%6."/>
+      <w:lvlJc w:val="left"/>
+      <w:pPr>
+        <w:ind w:left="4320" w:hanging="360"/>
+      </w:pPr>
+    </w:lvl>
+    <w:lvl w:ilvl="6" w:tplc="724EBF48">
+      <w:start w:val="1"/>
+      <w:numFmt w:val="decimal"/>
+      <w:lvlText w:val="%7."/>
+      <w:lvlJc w:val="left"/>
+      <w:pPr>
+        <w:ind w:left="5040" w:hanging="360"/>
+      </w:pPr>
+    </w:lvl>
+    <w:lvl w:ilvl="7" w:tplc="B64610BA">
+      <w:start w:val="1"/>
+      <w:numFmt w:val="lowerLetter"/>
+      <w:lvlText w:val="%8."/>
+      <w:lvlJc w:val="left"/>
+      <w:pPr>
+        <w:ind w:left="5760" w:hanging="360"/>
+      </w:pPr>
+    </w:lvl>
+    <w:lvl w:ilvl="8" w:tplc="29F2989E">
+      <w:start w:val="1"/>
+      <w:numFmt w:val="lowerRoman"/>
+      <w:lvlText w:val="%9."/>
+      <w:lvlJc w:val="left"/>
+      <w:pPr>
+        <w:ind w:left="6480" w:hanging="360"/>
+      </w:pPr>
+    </w:lvl>
+  </w:abstractNum>
+  <w:abstractNum w:abstractNumId="7" w15:restartNumberingAfterBreak="0">
+    <w:nsid w:val="36EA6E58"/>
+    <w:multiLevelType w:val="hybridMultilevel"/>
+    <w:tmpl w:val="08B8FAF6"/>
+    <w:lvl w:ilvl="0" w:tplc="3CEEFE50">
+      <w:start w:val="1"/>
+      <w:numFmt w:val="bullet"/>
+      <w:lvlText w:val="•"/>
+      <w:lvlJc w:val="left"/>
+      <w:pPr>
+        <w:ind w:left="720" w:hanging="360"/>
+      </w:pPr>
+    </w:lvl>
+    <w:lvl w:ilvl="1" w:tplc="E32A64C8">
+      <w:start w:val="1"/>
+      <w:numFmt w:val="bullet"/>
+      <w:lvlText w:val="◦"/>
+      <w:lvlJc w:val="left"/>
+      <w:pPr>
+        <w:ind w:left="1440" w:hanging="360"/>
+      </w:pPr>
+    </w:lvl>
+    <w:lvl w:ilvl="2" w:tplc="A8BA6268">
+      <w:start w:val="1"/>
+      <w:numFmt w:val="bullet"/>
+      <w:lvlText w:val="▪"/>
+      <w:lvlJc w:val="left"/>
+      <w:pPr>
+        <w:ind w:left="2160" w:hanging="360"/>
+      </w:pPr>
+    </w:lvl>
+    <w:lvl w:ilvl="3" w:tplc="9DD6846C">
+      <w:start w:val="1"/>
+      <w:numFmt w:val="bullet"/>
+      <w:lvlText w:val="•"/>
+      <w:lvlJc w:val="left"/>
+      <w:pPr>
+        <w:ind w:left="2880" w:hanging="360"/>
+      </w:pPr>
+    </w:lvl>
+    <w:lvl w:ilvl="4" w:tplc="893656FA">
+      <w:start w:val="1"/>
+      <w:numFmt w:val="bullet"/>
+      <w:lvlText w:val="◦"/>
+      <w:lvlJc w:val="left"/>
+      <w:pPr>
+        <w:ind w:left="3600" w:hanging="360"/>
+      </w:pPr>
+    </w:lvl>
+    <w:lvl w:ilvl="5" w:tplc="1EF03D3A">
+      <w:start w:val="1"/>
+      <w:numFmt w:val="bullet"/>
+      <w:lvlText w:val="▪"/>
+      <w:lvlJc w:val="left"/>
+      <w:pPr>
+        <w:ind w:left="4320" w:hanging="360"/>
+      </w:pPr>
+    </w:lvl>
+    <w:lvl w:ilvl="6" w:tplc="22C8CFD0">
+      <w:start w:val="1"/>
+      <w:numFmt w:val="bullet"/>
+      <w:lvlText w:val="•"/>
+      <w:lvlJc w:val="left"/>
+      <w:pPr>
+        <w:ind w:left="5040" w:hanging="360"/>
+      </w:pPr>
+    </w:lvl>
+    <w:lvl w:ilvl="7" w:tplc="1696CC56">
+      <w:start w:val="1"/>
+      <w:numFmt w:val="bullet"/>
+      <w:lvlText w:val="◦"/>
+      <w:lvlJc w:val="left"/>
+      <w:pPr>
+        <w:ind w:left="5760" w:hanging="360"/>
+      </w:pPr>
+    </w:lvl>
+    <w:lvl w:ilvl="8" w:tplc="A01A72F0">
+      <w:start w:val="1"/>
+      <w:numFmt w:val="bullet"/>
+      <w:lvlText w:val="▪"/>
+      <w:lvlJc w:val="left"/>
+      <w:pPr>
+        <w:ind w:left="6480" w:hanging="360"/>
+      </w:pPr>
+    </w:lvl>
+  </w:abstractNum>
+  <w:abstractNum w:abstractNumId="8" w15:restartNumberingAfterBreak="0">
     <w:nsid w:val="3878040B"/>
     <w:multiLevelType w:val="hybridMultilevel"/>
     <w:tmpl w:val="6FE28C0A"/>
@@ -5134,7 +5791,7 @@
       </w:pPr>
     </w:lvl>
   </w:abstractNum>
-  <w:abstractNum w:abstractNumId="5" w15:restartNumberingAfterBreak="0">
+  <w:abstractNum w:abstractNumId="9" w15:restartNumberingAfterBreak="0">
     <w:nsid w:val="3EA173EB"/>
     <w:multiLevelType w:val="hybridMultilevel"/>
     <w:tmpl w:val="98AEBD8E"/>
@@ -5220,7 +5877,179 @@
       </w:pPr>
     </w:lvl>
   </w:abstractNum>
-  <w:abstractNum w:abstractNumId="6" w15:restartNumberingAfterBreak="0">
+  <w:abstractNum w:abstractNumId="10" w15:restartNumberingAfterBreak="0">
+    <w:nsid w:val="3F347F6C"/>
+    <w:multiLevelType w:val="hybridMultilevel"/>
+    <w:tmpl w:val="63AE6C2E"/>
+    <w:lvl w:ilvl="0" w:tplc="7FC2C9C8">
+      <w:start w:val="1"/>
+      <w:numFmt w:val="bullet"/>
+      <w:lvlText w:val="•"/>
+      <w:lvlJc w:val="left"/>
+      <w:pPr>
+        <w:ind w:left="720" w:hanging="360"/>
+      </w:pPr>
+    </w:lvl>
+    <w:lvl w:ilvl="1" w:tplc="8E109418">
+      <w:start w:val="1"/>
+      <w:numFmt w:val="bullet"/>
+      <w:lvlText w:val="◦"/>
+      <w:lvlJc w:val="left"/>
+      <w:pPr>
+        <w:ind w:left="1440" w:hanging="360"/>
+      </w:pPr>
+    </w:lvl>
+    <w:lvl w:ilvl="2" w:tplc="DF7A0BEA">
+      <w:start w:val="1"/>
+      <w:numFmt w:val="bullet"/>
+      <w:lvlText w:val="▪"/>
+      <w:lvlJc w:val="left"/>
+      <w:pPr>
+        <w:ind w:left="2160" w:hanging="360"/>
+      </w:pPr>
+    </w:lvl>
+    <w:lvl w:ilvl="3" w:tplc="521A28A0">
+      <w:start w:val="1"/>
+      <w:numFmt w:val="bullet"/>
+      <w:lvlText w:val="•"/>
+      <w:lvlJc w:val="left"/>
+      <w:pPr>
+        <w:ind w:left="2880" w:hanging="360"/>
+      </w:pPr>
+    </w:lvl>
+    <w:lvl w:ilvl="4" w:tplc="DAD26B88">
+      <w:start w:val="1"/>
+      <w:numFmt w:val="bullet"/>
+      <w:lvlText w:val="◦"/>
+      <w:lvlJc w:val="left"/>
+      <w:pPr>
+        <w:ind w:left="3600" w:hanging="360"/>
+      </w:pPr>
+    </w:lvl>
+    <w:lvl w:ilvl="5" w:tplc="D85AA286">
+      <w:start w:val="1"/>
+      <w:numFmt w:val="bullet"/>
+      <w:lvlText w:val="▪"/>
+      <w:lvlJc w:val="left"/>
+      <w:pPr>
+        <w:ind w:left="4320" w:hanging="360"/>
+      </w:pPr>
+    </w:lvl>
+    <w:lvl w:ilvl="6" w:tplc="9C0262DA">
+      <w:start w:val="1"/>
+      <w:numFmt w:val="bullet"/>
+      <w:lvlText w:val="•"/>
+      <w:lvlJc w:val="left"/>
+      <w:pPr>
+        <w:ind w:left="5040" w:hanging="360"/>
+      </w:pPr>
+    </w:lvl>
+    <w:lvl w:ilvl="7" w:tplc="A3CC6C72">
+      <w:start w:val="1"/>
+      <w:numFmt w:val="bullet"/>
+      <w:lvlText w:val="◦"/>
+      <w:lvlJc w:val="left"/>
+      <w:pPr>
+        <w:ind w:left="5760" w:hanging="360"/>
+      </w:pPr>
+    </w:lvl>
+    <w:lvl w:ilvl="8" w:tplc="C8668046">
+      <w:start w:val="1"/>
+      <w:numFmt w:val="bullet"/>
+      <w:lvlText w:val="▪"/>
+      <w:lvlJc w:val="left"/>
+      <w:pPr>
+        <w:ind w:left="6480" w:hanging="360"/>
+      </w:pPr>
+    </w:lvl>
+  </w:abstractNum>
+  <w:abstractNum w:abstractNumId="11" w15:restartNumberingAfterBreak="0">
+    <w:nsid w:val="3FB36E53"/>
+    <w:multiLevelType w:val="hybridMultilevel"/>
+    <w:tmpl w:val="470C13CA"/>
+    <w:lvl w:ilvl="0" w:tplc="AA4CD57E">
+      <w:start w:val="1"/>
+      <w:numFmt w:val="bullet"/>
+      <w:lvlText w:val="•"/>
+      <w:lvlJc w:val="left"/>
+      <w:pPr>
+        <w:ind w:left="720" w:hanging="360"/>
+      </w:pPr>
+    </w:lvl>
+    <w:lvl w:ilvl="1" w:tplc="D10A1AC2">
+      <w:start w:val="1"/>
+      <w:numFmt w:val="bullet"/>
+      <w:lvlText w:val="◦"/>
+      <w:lvlJc w:val="left"/>
+      <w:pPr>
+        <w:ind w:left="1440" w:hanging="360"/>
+      </w:pPr>
+    </w:lvl>
+    <w:lvl w:ilvl="2" w:tplc="DB9EB7D0">
+      <w:start w:val="1"/>
+      <w:numFmt w:val="bullet"/>
+      <w:lvlText w:val="▪"/>
+      <w:lvlJc w:val="left"/>
+      <w:pPr>
+        <w:ind w:left="2160" w:hanging="360"/>
+      </w:pPr>
+    </w:lvl>
+    <w:lvl w:ilvl="3" w:tplc="251E358E">
+      <w:start w:val="1"/>
+      <w:numFmt w:val="bullet"/>
+      <w:lvlText w:val="•"/>
+      <w:lvlJc w:val="left"/>
+      <w:pPr>
+        <w:ind w:left="2880" w:hanging="360"/>
+      </w:pPr>
+    </w:lvl>
+    <w:lvl w:ilvl="4" w:tplc="158E4AF4">
+      <w:start w:val="1"/>
+      <w:numFmt w:val="bullet"/>
+      <w:lvlText w:val="◦"/>
+      <w:lvlJc w:val="left"/>
+      <w:pPr>
+        <w:ind w:left="3600" w:hanging="360"/>
+      </w:pPr>
+    </w:lvl>
+    <w:lvl w:ilvl="5" w:tplc="E4341ADC">
+      <w:start w:val="1"/>
+      <w:numFmt w:val="bullet"/>
+      <w:lvlText w:val="▪"/>
+      <w:lvlJc w:val="left"/>
+      <w:pPr>
+        <w:ind w:left="4320" w:hanging="360"/>
+      </w:pPr>
+    </w:lvl>
+    <w:lvl w:ilvl="6" w:tplc="D8D889E2">
+      <w:start w:val="1"/>
+      <w:numFmt w:val="bullet"/>
+      <w:lvlText w:val="•"/>
+      <w:lvlJc w:val="left"/>
+      <w:pPr>
+        <w:ind w:left="5040" w:hanging="360"/>
+      </w:pPr>
+    </w:lvl>
+    <w:lvl w:ilvl="7" w:tplc="0988EACC">
+      <w:start w:val="1"/>
+      <w:numFmt w:val="bullet"/>
+      <w:lvlText w:val="◦"/>
+      <w:lvlJc w:val="left"/>
+      <w:pPr>
+        <w:ind w:left="5760" w:hanging="360"/>
+      </w:pPr>
+    </w:lvl>
+    <w:lvl w:ilvl="8" w:tplc="53183434">
+      <w:start w:val="1"/>
+      <w:numFmt w:val="bullet"/>
+      <w:lvlText w:val="▪"/>
+      <w:lvlJc w:val="left"/>
+      <w:pPr>
+        <w:ind w:left="6480" w:hanging="360"/>
+      </w:pPr>
+    </w:lvl>
+  </w:abstractNum>
+  <w:abstractNum w:abstractNumId="12" w15:restartNumberingAfterBreak="0">
     <w:nsid w:val="449125A7"/>
     <w:multiLevelType w:val="hybridMultilevel"/>
     <w:tmpl w:val="81807D28"/>
@@ -5306,7 +6135,93 @@
       </w:pPr>
     </w:lvl>
   </w:abstractNum>
-  <w:abstractNum w:abstractNumId="7" w15:restartNumberingAfterBreak="0">
+  <w:abstractNum w:abstractNumId="13" w15:restartNumberingAfterBreak="0">
+    <w:nsid w:val="4CFE7718"/>
+    <w:multiLevelType w:val="hybridMultilevel"/>
+    <w:tmpl w:val="4B4E514E"/>
+    <w:lvl w:ilvl="0" w:tplc="AB0C8F08">
+      <w:start w:val="1"/>
+      <w:numFmt w:val="bullet"/>
+      <w:lvlText w:val="•"/>
+      <w:lvlJc w:val="left"/>
+      <w:pPr>
+        <w:ind w:left="720" w:hanging="360"/>
+      </w:pPr>
+    </w:lvl>
+    <w:lvl w:ilvl="1" w:tplc="92961E62">
+      <w:start w:val="1"/>
+      <w:numFmt w:val="bullet"/>
+      <w:lvlText w:val="◦"/>
+      <w:lvlJc w:val="left"/>
+      <w:pPr>
+        <w:ind w:left="1440" w:hanging="360"/>
+      </w:pPr>
+    </w:lvl>
+    <w:lvl w:ilvl="2" w:tplc="DA4290E8">
+      <w:start w:val="1"/>
+      <w:numFmt w:val="bullet"/>
+      <w:lvlText w:val="▪"/>
+      <w:lvlJc w:val="left"/>
+      <w:pPr>
+        <w:ind w:left="2160" w:hanging="360"/>
+      </w:pPr>
+    </w:lvl>
+    <w:lvl w:ilvl="3" w:tplc="9034C5E0">
+      <w:start w:val="1"/>
+      <w:numFmt w:val="bullet"/>
+      <w:lvlText w:val="•"/>
+      <w:lvlJc w:val="left"/>
+      <w:pPr>
+        <w:ind w:left="2880" w:hanging="360"/>
+      </w:pPr>
+    </w:lvl>
+    <w:lvl w:ilvl="4" w:tplc="DFBE2B42">
+      <w:start w:val="1"/>
+      <w:numFmt w:val="bullet"/>
+      <w:lvlText w:val="◦"/>
+      <w:lvlJc w:val="left"/>
+      <w:pPr>
+        <w:ind w:left="3600" w:hanging="360"/>
+      </w:pPr>
+    </w:lvl>
+    <w:lvl w:ilvl="5" w:tplc="F2FE86E0">
+      <w:start w:val="1"/>
+      <w:numFmt w:val="bullet"/>
+      <w:lvlText w:val="▪"/>
+      <w:lvlJc w:val="left"/>
+      <w:pPr>
+        <w:ind w:left="4320" w:hanging="360"/>
+      </w:pPr>
+    </w:lvl>
+    <w:lvl w:ilvl="6" w:tplc="DE168178">
+      <w:start w:val="1"/>
+      <w:numFmt w:val="bullet"/>
+      <w:lvlText w:val="•"/>
+      <w:lvlJc w:val="left"/>
+      <w:pPr>
+        <w:ind w:left="5040" w:hanging="360"/>
+      </w:pPr>
+    </w:lvl>
+    <w:lvl w:ilvl="7" w:tplc="36F846C4">
+      <w:start w:val="1"/>
+      <w:numFmt w:val="bullet"/>
+      <w:lvlText w:val="◦"/>
+      <w:lvlJc w:val="left"/>
+      <w:pPr>
+        <w:ind w:left="5760" w:hanging="360"/>
+      </w:pPr>
+    </w:lvl>
+    <w:lvl w:ilvl="8" w:tplc="4E0E07D4">
+      <w:start w:val="1"/>
+      <w:numFmt w:val="bullet"/>
+      <w:lvlText w:val="▪"/>
+      <w:lvlJc w:val="left"/>
+      <w:pPr>
+        <w:ind w:left="6480" w:hanging="360"/>
+      </w:pPr>
+    </w:lvl>
+  </w:abstractNum>
+  <w:abstractNum w:abstractNumId="14" w15:restartNumberingAfterBreak="0">
     <w:nsid w:val="4E224164"/>
     <w:multiLevelType w:val="hybridMultilevel"/>
     <w:tmpl w:val="96166214"/>
@@ -5319,7 +6234,7 @@
         <w:ind w:left="1080" w:hanging="360"/>
       </w:pPr>
       <w:rPr>
-        <w:rFonts w:hint="default" w:ascii="Symbol" w:hAnsi="Symbol"/>
+        <w:rFonts w:ascii="Symbol" w:hAnsi="Symbol" w:hint="default"/>
       </w:rPr>
     </w:lvl>
     <w:lvl w:ilvl="1" w:tplc="04090003" w:tentative="1">
@@ -5331,7 +6246,7 @@
         <w:ind w:left="1800" w:hanging="360"/>
       </w:pPr>
       <w:rPr>
-        <w:rFonts w:hint="default" w:ascii="Courier New" w:hAnsi="Courier New" w:cs="Courier New"/>
+        <w:rFonts w:ascii="Courier New" w:hAnsi="Courier New" w:cs="Courier New" w:hint="default"/>
       </w:rPr>
     </w:lvl>
     <w:lvl w:ilvl="2" w:tplc="04090005" w:tentative="1">
@@ -5343,7 +6258,7 @@
         <w:ind w:left="2520" w:hanging="360"/>
       </w:pPr>
       <w:rPr>
-        <w:rFonts w:hint="default" w:ascii="Wingdings" w:hAnsi="Wingdings"/>
+        <w:rFonts w:ascii="Wingdings" w:hAnsi="Wingdings" w:hint="default"/>
       </w:rPr>
     </w:lvl>
     <w:lvl w:ilvl="3" w:tplc="04090001" w:tentative="1">
@@ -5355,7 +6270,7 @@
         <w:ind w:left="3240" w:hanging="360"/>
       </w:pPr>
       <w:rPr>
-        <w:rFonts w:hint="default" w:ascii="Symbol" w:hAnsi="Symbol"/>
+        <w:rFonts w:ascii="Symbol" w:hAnsi="Symbol" w:hint="default"/>
       </w:rPr>
     </w:lvl>
     <w:lvl w:ilvl="4" w:tplc="04090003" w:tentative="1">
@@ -5367,7 +6282,7 @@
         <w:ind w:left="3960" w:hanging="360"/>
       </w:pPr>
       <w:rPr>
-        <w:rFonts w:hint="default" w:ascii="Courier New" w:hAnsi="Courier New" w:cs="Courier New"/>
+        <w:rFonts w:ascii="Courier New" w:hAnsi="Courier New" w:cs="Courier New" w:hint="default"/>
       </w:rPr>
     </w:lvl>
     <w:lvl w:ilvl="5" w:tplc="04090005" w:tentative="1">
@@ -5379,7 +6294,7 @@
         <w:ind w:left="4680" w:hanging="360"/>
       </w:pPr>
       <w:rPr>
-        <w:rFonts w:hint="default" w:ascii="Wingdings" w:hAnsi="Wingdings"/>
+        <w:rFonts w:ascii="Wingdings" w:hAnsi="Wingdings" w:hint="default"/>
       </w:rPr>
     </w:lvl>
     <w:lvl w:ilvl="6" w:tplc="04090001" w:tentative="1">
@@ -5391,7 +6306,7 @@
         <w:ind w:left="5400" w:hanging="360"/>
       </w:pPr>
       <w:rPr>
-        <w:rFonts w:hint="default" w:ascii="Symbol" w:hAnsi="Symbol"/>
+        <w:rFonts w:ascii="Symbol" w:hAnsi="Symbol" w:hint="default"/>
       </w:rPr>
     </w:lvl>
     <w:lvl w:ilvl="7" w:tplc="04090003" w:tentative="1">
@@ -5403,7 +6318,7 @@
         <w:ind w:left="6120" w:hanging="360"/>
       </w:pPr>
       <w:rPr>
-        <w:rFonts w:hint="default" w:ascii="Courier New" w:hAnsi="Courier New" w:cs="Courier New"/>
+        <w:rFonts w:ascii="Courier New" w:hAnsi="Courier New" w:cs="Courier New" w:hint="default"/>
       </w:rPr>
     </w:lvl>
     <w:lvl w:ilvl="8" w:tplc="04090005" w:tentative="1">
@@ -5415,11 +6330,97 @@
         <w:ind w:left="6840" w:hanging="360"/>
       </w:pPr>
       <w:rPr>
-        <w:rFonts w:hint="default" w:ascii="Wingdings" w:hAnsi="Wingdings"/>
+        <w:rFonts w:ascii="Wingdings" w:hAnsi="Wingdings" w:hint="default"/>
       </w:rPr>
     </w:lvl>
   </w:abstractNum>
-  <w:abstractNum w:abstractNumId="8" w15:restartNumberingAfterBreak="0">
+  <w:abstractNum w:abstractNumId="15" w15:restartNumberingAfterBreak="0">
+    <w:nsid w:val="61E12E0F"/>
+    <w:multiLevelType w:val="hybridMultilevel"/>
+    <w:tmpl w:val="63F8C02E"/>
+    <w:lvl w:ilvl="0" w:tplc="58F4ECC8">
+      <w:start w:val="1"/>
+      <w:numFmt w:val="decimal"/>
+      <w:lvlText w:val="%1."/>
+      <w:lvlJc w:val="left"/>
+      <w:pPr>
+        <w:ind w:left="720" w:hanging="360"/>
+      </w:pPr>
+    </w:lvl>
+    <w:lvl w:ilvl="1" w:tplc="39E8FF4E">
+      <w:start w:val="1"/>
+      <w:numFmt w:val="lowerLetter"/>
+      <w:lvlText w:val="%2."/>
+      <w:lvlJc w:val="left"/>
+      <w:pPr>
+        <w:ind w:left="1440" w:hanging="360"/>
+      </w:pPr>
+    </w:lvl>
+    <w:lvl w:ilvl="2" w:tplc="19D097E0">
+      <w:start w:val="1"/>
+      <w:numFmt w:val="lowerRoman"/>
+      <w:lvlText w:val="%3."/>
+      <w:lvlJc w:val="left"/>
+      <w:pPr>
+        <w:ind w:left="2160" w:hanging="360"/>
+      </w:pPr>
+    </w:lvl>
+    <w:lvl w:ilvl="3" w:tplc="F6B28E6A">
+      <w:start w:val="1"/>
+      <w:numFmt w:val="decimal"/>
+      <w:lvlText w:val="%4."/>
+      <w:lvlJc w:val="left"/>
+      <w:pPr>
+        <w:ind w:left="2880" w:hanging="360"/>
+      </w:pPr>
+    </w:lvl>
+    <w:lvl w:ilvl="4" w:tplc="E90651A0">
+      <w:start w:val="1"/>
+      <w:numFmt w:val="lowerLetter"/>
+      <w:lvlText w:val="%5."/>
+      <w:lvlJc w:val="left"/>
+      <w:pPr>
+        <w:ind w:left="3600" w:hanging="360"/>
+      </w:pPr>
+    </w:lvl>
+    <w:lvl w:ilvl="5" w:tplc="DE560EA4">
+      <w:start w:val="1"/>
+      <w:numFmt w:val="lowerRoman"/>
+      <w:lvlText w:val="%6."/>
+      <w:lvlJc w:val="left"/>
+      <w:pPr>
+        <w:ind w:left="4320" w:hanging="360"/>
+      </w:pPr>
+    </w:lvl>
+    <w:lvl w:ilvl="6" w:tplc="2380373E">
+      <w:start w:val="1"/>
+      <w:numFmt w:val="decimal"/>
+      <w:lvlText w:val="%7."/>
+      <w:lvlJc w:val="left"/>
+      <w:pPr>
+        <w:ind w:left="5040" w:hanging="360"/>
+      </w:pPr>
+    </w:lvl>
+    <w:lvl w:ilvl="7" w:tplc="AB9E7C3A">
+      <w:start w:val="1"/>
+      <w:numFmt w:val="lowerLetter"/>
+      <w:lvlText w:val="%8."/>
+      <w:lvlJc w:val="left"/>
+      <w:pPr>
+        <w:ind w:left="5760" w:hanging="360"/>
+      </w:pPr>
+    </w:lvl>
+    <w:lvl w:ilvl="8" w:tplc="334092BE">
+      <w:start w:val="1"/>
+      <w:numFmt w:val="lowerRoman"/>
+      <w:lvlText w:val="%9."/>
+      <w:lvlJc w:val="left"/>
+      <w:pPr>
+        <w:ind w:left="6480" w:hanging="360"/>
+      </w:pPr>
+    </w:lvl>
+  </w:abstractNum>
+  <w:abstractNum w:abstractNumId="16" w15:restartNumberingAfterBreak="0">
     <w:nsid w:val="62065483"/>
     <w:multiLevelType w:val="hybridMultilevel"/>
     <w:tmpl w:val="D794D918"/>
@@ -5505,7 +6506,7 @@
       </w:pPr>
     </w:lvl>
   </w:abstractNum>
-  <w:abstractNum w:abstractNumId="9" w15:restartNumberingAfterBreak="0">
+  <w:abstractNum w:abstractNumId="17" w15:restartNumberingAfterBreak="0">
     <w:nsid w:val="63CE1B1A"/>
     <w:multiLevelType w:val="multilevel"/>
     <w:tmpl w:val="66322704"/>
@@ -5548,7 +6549,7 @@
         <w:ind w:left="1440" w:hanging="360"/>
       </w:pPr>
       <w:rPr>
-        <w:rFonts w:hint="default" w:ascii="Symbol" w:hAnsi="Symbol"/>
+        <w:rFonts w:ascii="Symbol" w:hAnsi="Symbol" w:hint="default"/>
       </w:rPr>
     </w:lvl>
     <w:lvl w:ilvl="4">
@@ -5597,7 +6598,93 @@
       </w:pPr>
     </w:lvl>
   </w:abstractNum>
-  <w:abstractNum w:abstractNumId="10" w15:restartNumberingAfterBreak="0">
+  <w:abstractNum w:abstractNumId="18" w15:restartNumberingAfterBreak="0">
+    <w:nsid w:val="65333189"/>
+    <w:multiLevelType w:val="hybridMultilevel"/>
+    <w:tmpl w:val="2760EE02"/>
+    <w:lvl w:ilvl="0" w:tplc="8514F7C0">
+      <w:start w:val="1"/>
+      <w:numFmt w:val="bullet"/>
+      <w:lvlText w:val="•"/>
+      <w:lvlJc w:val="left"/>
+      <w:pPr>
+        <w:ind w:left="720" w:hanging="360"/>
+      </w:pPr>
+    </w:lvl>
+    <w:lvl w:ilvl="1" w:tplc="03284DA6">
+      <w:start w:val="1"/>
+      <w:numFmt w:val="bullet"/>
+      <w:lvlText w:val="◦"/>
+      <w:lvlJc w:val="left"/>
+      <w:pPr>
+        <w:ind w:left="1440" w:hanging="360"/>
+      </w:pPr>
+    </w:lvl>
+    <w:lvl w:ilvl="2" w:tplc="5434BF2C">
+      <w:start w:val="1"/>
+      <w:numFmt w:val="bullet"/>
+      <w:lvlText w:val="▪"/>
+      <w:lvlJc w:val="left"/>
+      <w:pPr>
+        <w:ind w:left="2160" w:hanging="360"/>
+      </w:pPr>
+    </w:lvl>
+    <w:lvl w:ilvl="3" w:tplc="73003338">
+      <w:start w:val="1"/>
+      <w:numFmt w:val="bullet"/>
+      <w:lvlText w:val="•"/>
+      <w:lvlJc w:val="left"/>
+      <w:pPr>
+        <w:ind w:left="2880" w:hanging="360"/>
+      </w:pPr>
+    </w:lvl>
+    <w:lvl w:ilvl="4" w:tplc="50449A7A">
+      <w:start w:val="1"/>
+      <w:numFmt w:val="bullet"/>
+      <w:lvlText w:val="◦"/>
+      <w:lvlJc w:val="left"/>
+      <w:pPr>
+        <w:ind w:left="3600" w:hanging="360"/>
+      </w:pPr>
+    </w:lvl>
+    <w:lvl w:ilvl="5" w:tplc="B7081DEA">
+      <w:start w:val="1"/>
+      <w:numFmt w:val="bullet"/>
+      <w:lvlText w:val="▪"/>
+      <w:lvlJc w:val="left"/>
+      <w:pPr>
+        <w:ind w:left="4320" w:hanging="360"/>
+      </w:pPr>
+    </w:lvl>
+    <w:lvl w:ilvl="6" w:tplc="F7946D52">
+      <w:start w:val="1"/>
+      <w:numFmt w:val="bullet"/>
+      <w:lvlText w:val="•"/>
+      <w:lvlJc w:val="left"/>
+      <w:pPr>
+        <w:ind w:left="5040" w:hanging="360"/>
+      </w:pPr>
+    </w:lvl>
+    <w:lvl w:ilvl="7" w:tplc="486CEB3E">
+      <w:start w:val="1"/>
+      <w:numFmt w:val="bullet"/>
+      <w:lvlText w:val="◦"/>
+      <w:lvlJc w:val="left"/>
+      <w:pPr>
+        <w:ind w:left="5760" w:hanging="360"/>
+      </w:pPr>
+    </w:lvl>
+    <w:lvl w:ilvl="8" w:tplc="5622E176">
+      <w:start w:val="1"/>
+      <w:numFmt w:val="bullet"/>
+      <w:lvlText w:val="▪"/>
+      <w:lvlJc w:val="left"/>
+      <w:pPr>
+        <w:ind w:left="6480" w:hanging="360"/>
+      </w:pPr>
+    </w:lvl>
+  </w:abstractNum>
+  <w:abstractNum w:abstractNumId="19" w15:restartNumberingAfterBreak="0">
     <w:nsid w:val="6D297A07"/>
     <w:multiLevelType w:val="hybridMultilevel"/>
     <w:tmpl w:val="7B7A8ADE"/>
@@ -5683,7 +6770,93 @@
       </w:pPr>
     </w:lvl>
   </w:abstractNum>
-  <w:abstractNum w:abstractNumId="11" w15:restartNumberingAfterBreak="0">
+  <w:abstractNum w:abstractNumId="20" w15:restartNumberingAfterBreak="0">
+    <w:nsid w:val="6ECC4A98"/>
+    <w:multiLevelType w:val="hybridMultilevel"/>
+    <w:tmpl w:val="EA66F360"/>
+    <w:lvl w:ilvl="0" w:tplc="6464BCC0">
+      <w:start w:val="1"/>
+      <w:numFmt w:val="bullet"/>
+      <w:lvlText w:val="•"/>
+      <w:lvlJc w:val="left"/>
+      <w:pPr>
+        <w:ind w:left="720" w:hanging="360"/>
+      </w:pPr>
+    </w:lvl>
+    <w:lvl w:ilvl="1" w:tplc="BAA629AA">
+      <w:start w:val="1"/>
+      <w:numFmt w:val="bullet"/>
+      <w:lvlText w:val="◦"/>
+      <w:lvlJc w:val="left"/>
+      <w:pPr>
+        <w:ind w:left="1440" w:hanging="360"/>
+      </w:pPr>
+    </w:lvl>
+    <w:lvl w:ilvl="2" w:tplc="E5C8CEFC">
+      <w:start w:val="1"/>
+      <w:numFmt w:val="bullet"/>
+      <w:lvlText w:val="▪"/>
+      <w:lvlJc w:val="left"/>
+      <w:pPr>
+        <w:ind w:left="2160" w:hanging="360"/>
+      </w:pPr>
+    </w:lvl>
+    <w:lvl w:ilvl="3" w:tplc="260C0430">
+      <w:start w:val="1"/>
+      <w:numFmt w:val="bullet"/>
+      <w:lvlText w:val="•"/>
+      <w:lvlJc w:val="left"/>
+      <w:pPr>
+        <w:ind w:left="2880" w:hanging="360"/>
+      </w:pPr>
+    </w:lvl>
+    <w:lvl w:ilvl="4" w:tplc="E8582B7A">
+      <w:start w:val="1"/>
+      <w:numFmt w:val="bullet"/>
+      <w:lvlText w:val="◦"/>
+      <w:lvlJc w:val="left"/>
+      <w:pPr>
+        <w:ind w:left="3600" w:hanging="360"/>
+      </w:pPr>
+    </w:lvl>
+    <w:lvl w:ilvl="5" w:tplc="7486B706">
+      <w:start w:val="1"/>
+      <w:numFmt w:val="bullet"/>
+      <w:lvlText w:val="▪"/>
+      <w:lvlJc w:val="left"/>
+      <w:pPr>
+        <w:ind w:left="4320" w:hanging="360"/>
+      </w:pPr>
+    </w:lvl>
+    <w:lvl w:ilvl="6" w:tplc="0012F072">
+      <w:start w:val="1"/>
+      <w:numFmt w:val="bullet"/>
+      <w:lvlText w:val="•"/>
+      <w:lvlJc w:val="left"/>
+      <w:pPr>
+        <w:ind w:left="5040" w:hanging="360"/>
+      </w:pPr>
+    </w:lvl>
+    <w:lvl w:ilvl="7" w:tplc="0E3210C2">
+      <w:start w:val="1"/>
+      <w:numFmt w:val="bullet"/>
+      <w:lvlText w:val="◦"/>
+      <w:lvlJc w:val="left"/>
+      <w:pPr>
+        <w:ind w:left="5760" w:hanging="360"/>
+      </w:pPr>
+    </w:lvl>
+    <w:lvl w:ilvl="8" w:tplc="405C7DD4">
+      <w:start w:val="1"/>
+      <w:numFmt w:val="bullet"/>
+      <w:lvlText w:val="▪"/>
+      <w:lvlJc w:val="left"/>
+      <w:pPr>
+        <w:ind w:left="6480" w:hanging="360"/>
+      </w:pPr>
+    </w:lvl>
+  </w:abstractNum>
+  <w:abstractNum w:abstractNumId="21" w15:restartNumberingAfterBreak="0">
     <w:nsid w:val="70E43554"/>
     <w:multiLevelType w:val="hybridMultilevel"/>
     <w:tmpl w:val="35C08FEE"/>
@@ -5769,7 +6942,7 @@
       </w:pPr>
     </w:lvl>
   </w:abstractNum>
-  <w:abstractNum w:abstractNumId="12" w15:restartNumberingAfterBreak="0">
+  <w:abstractNum w:abstractNumId="22" w15:restartNumberingAfterBreak="0">
     <w:nsid w:val="76F02E24"/>
     <w:multiLevelType w:val="hybridMultilevel"/>
     <w:tmpl w:val="BC4EA2CA"/>
@@ -5855,7 +7028,7 @@
       </w:pPr>
     </w:lvl>
   </w:abstractNum>
-  <w:abstractNum w:abstractNumId="13" w15:restartNumberingAfterBreak="0">
+  <w:abstractNum w:abstractNumId="23" w15:restartNumberingAfterBreak="0">
     <w:nsid w:val="7741387C"/>
     <w:multiLevelType w:val="multilevel"/>
     <w:tmpl w:val="4E36DC30"/>
@@ -5968,7 +7141,93 @@
       </w:rPr>
     </w:lvl>
   </w:abstractNum>
-  <w:abstractNum w:abstractNumId="14" w15:restartNumberingAfterBreak="0">
+  <w:abstractNum w:abstractNumId="24" w15:restartNumberingAfterBreak="0">
+    <w:nsid w:val="78082633"/>
+    <w:multiLevelType w:val="hybridMultilevel"/>
+    <w:tmpl w:val="7E423970"/>
+    <w:lvl w:ilvl="0" w:tplc="CECAD396">
+      <w:start w:val="1"/>
+      <w:numFmt w:val="bullet"/>
+      <w:lvlText w:val="•"/>
+      <w:lvlJc w:val="left"/>
+      <w:pPr>
+        <w:ind w:left="720" w:hanging="360"/>
+      </w:pPr>
+    </w:lvl>
+    <w:lvl w:ilvl="1" w:tplc="C2B42292">
+      <w:start w:val="1"/>
+      <w:numFmt w:val="bullet"/>
+      <w:lvlText w:val="◦"/>
+      <w:lvlJc w:val="left"/>
+      <w:pPr>
+        <w:ind w:left="1440" w:hanging="360"/>
+      </w:pPr>
+    </w:lvl>
+    <w:lvl w:ilvl="2" w:tplc="BD563920">
+      <w:start w:val="1"/>
+      <w:numFmt w:val="bullet"/>
+      <w:lvlText w:val="▪"/>
+      <w:lvlJc w:val="left"/>
+      <w:pPr>
+        <w:ind w:left="2160" w:hanging="360"/>
+      </w:pPr>
+    </w:lvl>
+    <w:lvl w:ilvl="3" w:tplc="E190F9D2">
+      <w:start w:val="1"/>
+      <w:numFmt w:val="bullet"/>
+      <w:lvlText w:val="•"/>
+      <w:lvlJc w:val="left"/>
+      <w:pPr>
+        <w:ind w:left="2880" w:hanging="360"/>
+      </w:pPr>
+    </w:lvl>
+    <w:lvl w:ilvl="4" w:tplc="8F508C98">
+      <w:start w:val="1"/>
+      <w:numFmt w:val="bullet"/>
+      <w:lvlText w:val="◦"/>
+      <w:lvlJc w:val="left"/>
+      <w:pPr>
+        <w:ind w:left="3600" w:hanging="360"/>
+      </w:pPr>
+    </w:lvl>
+    <w:lvl w:ilvl="5" w:tplc="1F1A8652">
+      <w:start w:val="1"/>
+      <w:numFmt w:val="bullet"/>
+      <w:lvlText w:val="▪"/>
+      <w:lvlJc w:val="left"/>
+      <w:pPr>
+        <w:ind w:left="4320" w:hanging="360"/>
+      </w:pPr>
+    </w:lvl>
+    <w:lvl w:ilvl="6" w:tplc="67A6CFC2">
+      <w:start w:val="1"/>
+      <w:numFmt w:val="bullet"/>
+      <w:lvlText w:val="•"/>
+      <w:lvlJc w:val="left"/>
+      <w:pPr>
+        <w:ind w:left="5040" w:hanging="360"/>
+      </w:pPr>
+    </w:lvl>
+    <w:lvl w:ilvl="7" w:tplc="C3D443B0">
+      <w:start w:val="1"/>
+      <w:numFmt w:val="bullet"/>
+      <w:lvlText w:val="◦"/>
+      <w:lvlJc w:val="left"/>
+      <w:pPr>
+        <w:ind w:left="5760" w:hanging="360"/>
+      </w:pPr>
+    </w:lvl>
+    <w:lvl w:ilvl="8" w:tplc="476ECC80">
+      <w:start w:val="1"/>
+      <w:numFmt w:val="bullet"/>
+      <w:lvlText w:val="▪"/>
+      <w:lvlJc w:val="left"/>
+      <w:pPr>
+        <w:ind w:left="6480" w:hanging="360"/>
+      </w:pPr>
+    </w:lvl>
+  </w:abstractNum>
+  <w:abstractNum w:abstractNumId="25" w15:restartNumberingAfterBreak="0">
     <w:nsid w:val="7E735A51"/>
     <w:multiLevelType w:val="hybridMultilevel"/>
     <w:tmpl w:val="2C648694"/>
@@ -5981,7 +7240,7 @@
         <w:ind w:left="1080" w:hanging="360"/>
       </w:pPr>
       <w:rPr>
-        <w:rFonts w:hint="default" w:ascii="Symbol" w:hAnsi="Symbol"/>
+        <w:rFonts w:ascii="Symbol" w:hAnsi="Symbol" w:hint="default"/>
       </w:rPr>
     </w:lvl>
     <w:lvl w:ilvl="1" w:tplc="04090003" w:tentative="1">
@@ -5993,7 +7252,7 @@
         <w:ind w:left="1800" w:hanging="360"/>
       </w:pPr>
       <w:rPr>
-        <w:rFonts w:hint="default" w:ascii="Courier New" w:hAnsi="Courier New" w:cs="Courier New"/>
+        <w:rFonts w:ascii="Courier New" w:hAnsi="Courier New" w:cs="Courier New" w:hint="default"/>
       </w:rPr>
     </w:lvl>
     <w:lvl w:ilvl="2" w:tplc="04090005" w:tentative="1">
@@ -6005,7 +7264,7 @@
         <w:ind w:left="2520" w:hanging="360"/>
       </w:pPr>
       <w:rPr>
-        <w:rFonts w:hint="default" w:ascii="Wingdings" w:hAnsi="Wingdings"/>
+        <w:rFonts w:ascii="Wingdings" w:hAnsi="Wingdings" w:hint="default"/>
       </w:rPr>
     </w:lvl>
     <w:lvl w:ilvl="3" w:tplc="04090001" w:tentative="1">
@@ -6017,7 +7276,7 @@
         <w:ind w:left="3240" w:hanging="360"/>
       </w:pPr>
       <w:rPr>
-        <w:rFonts w:hint="default" w:ascii="Symbol" w:hAnsi="Symbol"/>
+        <w:rFonts w:ascii="Symbol" w:hAnsi="Symbol" w:hint="default"/>
       </w:rPr>
     </w:lvl>
     <w:lvl w:ilvl="4" w:tplc="04090003" w:tentative="1">
@@ -6029,7 +7288,7 @@
         <w:ind w:left="3960" w:hanging="360"/>
       </w:pPr>
       <w:rPr>
-        <w:rFonts w:hint="default" w:ascii="Courier New" w:hAnsi="Courier New" w:cs="Courier New"/>
+        <w:rFonts w:ascii="Courier New" w:hAnsi="Courier New" w:cs="Courier New" w:hint="default"/>
       </w:rPr>
     </w:lvl>
     <w:lvl w:ilvl="5" w:tplc="04090005" w:tentative="1">
@@ -6041,7 +7300,7 @@
         <w:ind w:left="4680" w:hanging="360"/>
       </w:pPr>
       <w:rPr>
-        <w:rFonts w:hint="default" w:ascii="Wingdings" w:hAnsi="Wingdings"/>
+        <w:rFonts w:ascii="Wingdings" w:hAnsi="Wingdings" w:hint="default"/>
       </w:rPr>
     </w:lvl>
     <w:lvl w:ilvl="6" w:tplc="04090001" w:tentative="1">
@@ -6053,7 +7312,7 @@
         <w:ind w:left="5400" w:hanging="360"/>
       </w:pPr>
       <w:rPr>
-        <w:rFonts w:hint="default" w:ascii="Symbol" w:hAnsi="Symbol"/>
+        <w:rFonts w:ascii="Symbol" w:hAnsi="Symbol" w:hint="default"/>
       </w:rPr>
     </w:lvl>
     <w:lvl w:ilvl="7" w:tplc="04090003" w:tentative="1">
@@ -6065,7 +7324,7 @@
         <w:ind w:left="6120" w:hanging="360"/>
       </w:pPr>
       <w:rPr>
-        <w:rFonts w:hint="default" w:ascii="Courier New" w:hAnsi="Courier New" w:cs="Courier New"/>
+        <w:rFonts w:ascii="Courier New" w:hAnsi="Courier New" w:cs="Courier New" w:hint="default"/>
       </w:rPr>
     </w:lvl>
     <w:lvl w:ilvl="8" w:tplc="04090005" w:tentative="1">
@@ -6077,1011 +7336,87 @@
         <w:ind w:left="6840" w:hanging="360"/>
       </w:pPr>
       <w:rPr>
-        <w:rFonts w:hint="default" w:ascii="Wingdings" w:hAnsi="Wingdings"/>
+        <w:rFonts w:ascii="Wingdings" w:hAnsi="Wingdings" w:hint="default"/>
       </w:rPr>
-    </w:lvl>
-  </w:abstractNum>
-  <w:abstractNum w:abstractNumId="15">
-    <w:multiLevelType w:val="hybridMultilevel"/>
-    <w:lvl w:ilvl="0">
-      <w:start w:val="1"/>
-      <w:numFmt w:val="bullet"/>
-      <w:lvlText w:val="•"/>
-      <w:lvlJc w:val="left"/>
-      <w:pPr>
-        <w:ind w:left="720" w:hanging="360"/>
-      </w:pPr>
-    </w:lvl>
-    <w:lvl w:ilvl="1">
-      <w:start w:val="1"/>
-      <w:numFmt w:val="bullet"/>
-      <w:lvlText w:val="◦"/>
-      <w:lvlJc w:val="left"/>
-      <w:pPr>
-        <w:ind w:left="1440" w:hanging="360"/>
-      </w:pPr>
-    </w:lvl>
-    <w:lvl w:ilvl="2">
-      <w:start w:val="1"/>
-      <w:numFmt w:val="bullet"/>
-      <w:lvlText w:val="▪"/>
-      <w:lvlJc w:val="left"/>
-      <w:pPr>
-        <w:ind w:left="2160" w:hanging="360"/>
-      </w:pPr>
-    </w:lvl>
-    <w:lvl w:ilvl="3">
-      <w:start w:val="1"/>
-      <w:numFmt w:val="bullet"/>
-      <w:lvlText w:val="•"/>
-      <w:lvlJc w:val="left"/>
-      <w:pPr>
-        <w:ind w:left="2880" w:hanging="360"/>
-      </w:pPr>
-    </w:lvl>
-    <w:lvl w:ilvl="4">
-      <w:start w:val="1"/>
-      <w:numFmt w:val="bullet"/>
-      <w:lvlText w:val="◦"/>
-      <w:lvlJc w:val="left"/>
-      <w:pPr>
-        <w:ind w:left="3600" w:hanging="360"/>
-      </w:pPr>
-    </w:lvl>
-    <w:lvl w:ilvl="5">
-      <w:start w:val="1"/>
-      <w:numFmt w:val="bullet"/>
-      <w:lvlText w:val="▪"/>
-      <w:lvlJc w:val="left"/>
-      <w:pPr>
-        <w:ind w:left="4320" w:hanging="360"/>
-      </w:pPr>
-    </w:lvl>
-    <w:lvl w:ilvl="6">
-      <w:start w:val="1"/>
-      <w:numFmt w:val="bullet"/>
-      <w:lvlText w:val="•"/>
-      <w:lvlJc w:val="left"/>
-      <w:pPr>
-        <w:ind w:left="5040" w:hanging="360"/>
-      </w:pPr>
-    </w:lvl>
-    <w:lvl w:ilvl="7">
-      <w:start w:val="1"/>
-      <w:numFmt w:val="bullet"/>
-      <w:lvlText w:val="◦"/>
-      <w:lvlJc w:val="left"/>
-      <w:pPr>
-        <w:ind w:left="5760" w:hanging="360"/>
-      </w:pPr>
-    </w:lvl>
-    <w:lvl w:ilvl="8">
-      <w:start w:val="1"/>
-      <w:numFmt w:val="bullet"/>
-      <w:lvlText w:val="▪"/>
-      <w:lvlJc w:val="left"/>
-      <w:pPr>
-        <w:ind w:left="6480" w:hanging="360"/>
-      </w:pPr>
-    </w:lvl>
-  </w:abstractNum>
-  <w:abstractNum w:abstractNumId="16">
-    <w:multiLevelType w:val="hybridMultilevel"/>
-    <w:lvl w:ilvl="0">
-      <w:start w:val="1"/>
-      <w:numFmt w:val="bullet"/>
-      <w:lvlText w:val="•"/>
-      <w:lvlJc w:val="left"/>
-      <w:pPr>
-        <w:ind w:left="720" w:hanging="360"/>
-      </w:pPr>
-    </w:lvl>
-    <w:lvl w:ilvl="1">
-      <w:start w:val="1"/>
-      <w:numFmt w:val="bullet"/>
-      <w:lvlText w:val="◦"/>
-      <w:lvlJc w:val="left"/>
-      <w:pPr>
-        <w:ind w:left="1440" w:hanging="360"/>
-      </w:pPr>
-    </w:lvl>
-    <w:lvl w:ilvl="2">
-      <w:start w:val="1"/>
-      <w:numFmt w:val="bullet"/>
-      <w:lvlText w:val="▪"/>
-      <w:lvlJc w:val="left"/>
-      <w:pPr>
-        <w:ind w:left="2160" w:hanging="360"/>
-      </w:pPr>
-    </w:lvl>
-    <w:lvl w:ilvl="3">
-      <w:start w:val="1"/>
-      <w:numFmt w:val="bullet"/>
-      <w:lvlText w:val="•"/>
-      <w:lvlJc w:val="left"/>
-      <w:pPr>
-        <w:ind w:left="2880" w:hanging="360"/>
-      </w:pPr>
-    </w:lvl>
-    <w:lvl w:ilvl="4">
-      <w:start w:val="1"/>
-      <w:numFmt w:val="bullet"/>
-      <w:lvlText w:val="◦"/>
-      <w:lvlJc w:val="left"/>
-      <w:pPr>
-        <w:ind w:left="3600" w:hanging="360"/>
-      </w:pPr>
-    </w:lvl>
-    <w:lvl w:ilvl="5">
-      <w:start w:val="1"/>
-      <w:numFmt w:val="bullet"/>
-      <w:lvlText w:val="▪"/>
-      <w:lvlJc w:val="left"/>
-      <w:pPr>
-        <w:ind w:left="4320" w:hanging="360"/>
-      </w:pPr>
-    </w:lvl>
-    <w:lvl w:ilvl="6">
-      <w:start w:val="1"/>
-      <w:numFmt w:val="bullet"/>
-      <w:lvlText w:val="•"/>
-      <w:lvlJc w:val="left"/>
-      <w:pPr>
-        <w:ind w:left="5040" w:hanging="360"/>
-      </w:pPr>
-    </w:lvl>
-    <w:lvl w:ilvl="7">
-      <w:start w:val="1"/>
-      <w:numFmt w:val="bullet"/>
-      <w:lvlText w:val="◦"/>
-      <w:lvlJc w:val="left"/>
-      <w:pPr>
-        <w:ind w:left="5760" w:hanging="360"/>
-      </w:pPr>
-    </w:lvl>
-    <w:lvl w:ilvl="8">
-      <w:start w:val="1"/>
-      <w:numFmt w:val="bullet"/>
-      <w:lvlText w:val="▪"/>
-      <w:lvlJc w:val="left"/>
-      <w:pPr>
-        <w:ind w:left="6480" w:hanging="360"/>
-      </w:pPr>
-    </w:lvl>
-  </w:abstractNum>
-  <w:abstractNum w:abstractNumId="17">
-    <w:multiLevelType w:val="hybridMultilevel"/>
-    <w:lvl w:ilvl="0">
-      <w:start w:val="1"/>
-      <w:numFmt w:val="bullet"/>
-      <w:lvlText w:val="•"/>
-      <w:lvlJc w:val="left"/>
-      <w:pPr>
-        <w:ind w:left="720" w:hanging="360"/>
-      </w:pPr>
-    </w:lvl>
-    <w:lvl w:ilvl="1">
-      <w:start w:val="1"/>
-      <w:numFmt w:val="bullet"/>
-      <w:lvlText w:val="◦"/>
-      <w:lvlJc w:val="left"/>
-      <w:pPr>
-        <w:ind w:left="1440" w:hanging="360"/>
-      </w:pPr>
-    </w:lvl>
-    <w:lvl w:ilvl="2">
-      <w:start w:val="1"/>
-      <w:numFmt w:val="bullet"/>
-      <w:lvlText w:val="▪"/>
-      <w:lvlJc w:val="left"/>
-      <w:pPr>
-        <w:ind w:left="2160" w:hanging="360"/>
-      </w:pPr>
-    </w:lvl>
-    <w:lvl w:ilvl="3">
-      <w:start w:val="1"/>
-      <w:numFmt w:val="bullet"/>
-      <w:lvlText w:val="•"/>
-      <w:lvlJc w:val="left"/>
-      <w:pPr>
-        <w:ind w:left="2880" w:hanging="360"/>
-      </w:pPr>
-    </w:lvl>
-    <w:lvl w:ilvl="4">
-      <w:start w:val="1"/>
-      <w:numFmt w:val="bullet"/>
-      <w:lvlText w:val="◦"/>
-      <w:lvlJc w:val="left"/>
-      <w:pPr>
-        <w:ind w:left="3600" w:hanging="360"/>
-      </w:pPr>
-    </w:lvl>
-    <w:lvl w:ilvl="5">
-      <w:start w:val="1"/>
-      <w:numFmt w:val="bullet"/>
-      <w:lvlText w:val="▪"/>
-      <w:lvlJc w:val="left"/>
-      <w:pPr>
-        <w:ind w:left="4320" w:hanging="360"/>
-      </w:pPr>
-    </w:lvl>
-    <w:lvl w:ilvl="6">
-      <w:start w:val="1"/>
-      <w:numFmt w:val="bullet"/>
-      <w:lvlText w:val="•"/>
-      <w:lvlJc w:val="left"/>
-      <w:pPr>
-        <w:ind w:left="5040" w:hanging="360"/>
-      </w:pPr>
-    </w:lvl>
-    <w:lvl w:ilvl="7">
-      <w:start w:val="1"/>
-      <w:numFmt w:val="bullet"/>
-      <w:lvlText w:val="◦"/>
-      <w:lvlJc w:val="left"/>
-      <w:pPr>
-        <w:ind w:left="5760" w:hanging="360"/>
-      </w:pPr>
-    </w:lvl>
-    <w:lvl w:ilvl="8">
-      <w:start w:val="1"/>
-      <w:numFmt w:val="bullet"/>
-      <w:lvlText w:val="▪"/>
-      <w:lvlJc w:val="left"/>
-      <w:pPr>
-        <w:ind w:left="6480" w:hanging="360"/>
-      </w:pPr>
-    </w:lvl>
-  </w:abstractNum>
-  <w:abstractNum w:abstractNumId="18">
-    <w:multiLevelType w:val="hybridMultilevel"/>
-    <w:lvl w:ilvl="0">
-      <w:start w:val="1"/>
-      <w:numFmt w:val="bullet"/>
-      <w:lvlText w:val="•"/>
-      <w:lvlJc w:val="left"/>
-      <w:pPr>
-        <w:ind w:left="720" w:hanging="360"/>
-      </w:pPr>
-    </w:lvl>
-    <w:lvl w:ilvl="1">
-      <w:start w:val="1"/>
-      <w:numFmt w:val="bullet"/>
-      <w:lvlText w:val="◦"/>
-      <w:lvlJc w:val="left"/>
-      <w:pPr>
-        <w:ind w:left="1440" w:hanging="360"/>
-      </w:pPr>
-    </w:lvl>
-    <w:lvl w:ilvl="2">
-      <w:start w:val="1"/>
-      <w:numFmt w:val="bullet"/>
-      <w:lvlText w:val="▪"/>
-      <w:lvlJc w:val="left"/>
-      <w:pPr>
-        <w:ind w:left="2160" w:hanging="360"/>
-      </w:pPr>
-    </w:lvl>
-    <w:lvl w:ilvl="3">
-      <w:start w:val="1"/>
-      <w:numFmt w:val="bullet"/>
-      <w:lvlText w:val="•"/>
-      <w:lvlJc w:val="left"/>
-      <w:pPr>
-        <w:ind w:left="2880" w:hanging="360"/>
-      </w:pPr>
-    </w:lvl>
-    <w:lvl w:ilvl="4">
-      <w:start w:val="1"/>
-      <w:numFmt w:val="bullet"/>
-      <w:lvlText w:val="◦"/>
-      <w:lvlJc w:val="left"/>
-      <w:pPr>
-        <w:ind w:left="3600" w:hanging="360"/>
-      </w:pPr>
-    </w:lvl>
-    <w:lvl w:ilvl="5">
-      <w:start w:val="1"/>
-      <w:numFmt w:val="bullet"/>
-      <w:lvlText w:val="▪"/>
-      <w:lvlJc w:val="left"/>
-      <w:pPr>
-        <w:ind w:left="4320" w:hanging="360"/>
-      </w:pPr>
-    </w:lvl>
-    <w:lvl w:ilvl="6">
-      <w:start w:val="1"/>
-      <w:numFmt w:val="bullet"/>
-      <w:lvlText w:val="•"/>
-      <w:lvlJc w:val="left"/>
-      <w:pPr>
-        <w:ind w:left="5040" w:hanging="360"/>
-      </w:pPr>
-    </w:lvl>
-    <w:lvl w:ilvl="7">
-      <w:start w:val="1"/>
-      <w:numFmt w:val="bullet"/>
-      <w:lvlText w:val="◦"/>
-      <w:lvlJc w:val="left"/>
-      <w:pPr>
-        <w:ind w:left="5760" w:hanging="360"/>
-      </w:pPr>
-    </w:lvl>
-    <w:lvl w:ilvl="8">
-      <w:start w:val="1"/>
-      <w:numFmt w:val="bullet"/>
-      <w:lvlText w:val="▪"/>
-      <w:lvlJc w:val="left"/>
-      <w:pPr>
-        <w:ind w:left="6480" w:hanging="360"/>
-      </w:pPr>
-    </w:lvl>
-  </w:abstractNum>
-  <w:abstractNum w:abstractNumId="19">
-    <w:multiLevelType w:val="hybridMultilevel"/>
-    <w:lvl w:ilvl="0">
-      <w:start w:val="1"/>
-      <w:numFmt w:val="decimal"/>
-      <w:lvlText w:val="%1."/>
-      <w:lvlJc w:val="left"/>
-      <w:pPr>
-        <w:ind w:left="720" w:hanging="360"/>
-      </w:pPr>
-    </w:lvl>
-    <w:lvl w:ilvl="1">
-      <w:start w:val="1"/>
-      <w:numFmt w:val="lowerLetter"/>
-      <w:lvlText w:val="%2."/>
-      <w:lvlJc w:val="left"/>
-      <w:pPr>
-        <w:ind w:left="1440" w:hanging="360"/>
-      </w:pPr>
-    </w:lvl>
-    <w:lvl w:ilvl="2">
-      <w:start w:val="1"/>
-      <w:numFmt w:val="lowerRoman"/>
-      <w:lvlText w:val="%3."/>
-      <w:lvlJc w:val="left"/>
-      <w:pPr>
-        <w:ind w:left="2160" w:hanging="360"/>
-      </w:pPr>
-    </w:lvl>
-    <w:lvl w:ilvl="3">
-      <w:start w:val="1"/>
-      <w:numFmt w:val="decimal"/>
-      <w:lvlText w:val="%4."/>
-      <w:lvlJc w:val="left"/>
-      <w:pPr>
-        <w:ind w:left="2880" w:hanging="360"/>
-      </w:pPr>
-    </w:lvl>
-    <w:lvl w:ilvl="4">
-      <w:start w:val="1"/>
-      <w:numFmt w:val="lowerLetter"/>
-      <w:lvlText w:val="%5."/>
-      <w:lvlJc w:val="left"/>
-      <w:pPr>
-        <w:ind w:left="3600" w:hanging="360"/>
-      </w:pPr>
-    </w:lvl>
-    <w:lvl w:ilvl="5">
-      <w:start w:val="1"/>
-      <w:numFmt w:val="lowerRoman"/>
-      <w:lvlText w:val="%6."/>
-      <w:lvlJc w:val="left"/>
-      <w:pPr>
-        <w:ind w:left="4320" w:hanging="360"/>
-      </w:pPr>
-    </w:lvl>
-    <w:lvl w:ilvl="6">
-      <w:start w:val="1"/>
-      <w:numFmt w:val="decimal"/>
-      <w:lvlText w:val="%7."/>
-      <w:lvlJc w:val="left"/>
-      <w:pPr>
-        <w:ind w:left="5040" w:hanging="360"/>
-      </w:pPr>
-    </w:lvl>
-    <w:lvl w:ilvl="7">
-      <w:start w:val="1"/>
-      <w:numFmt w:val="lowerLetter"/>
-      <w:lvlText w:val="%8."/>
-      <w:lvlJc w:val="left"/>
-      <w:pPr>
-        <w:ind w:left="5760" w:hanging="360"/>
-      </w:pPr>
-    </w:lvl>
-    <w:lvl w:ilvl="8">
-      <w:start w:val="1"/>
-      <w:numFmt w:val="lowerRoman"/>
-      <w:lvlText w:val="%9."/>
-      <w:lvlJc w:val="left"/>
-      <w:pPr>
-        <w:ind w:left="6480" w:hanging="360"/>
-      </w:pPr>
-    </w:lvl>
-  </w:abstractNum>
-  <w:abstractNum w:abstractNumId="20">
-    <w:multiLevelType w:val="hybridMultilevel"/>
-    <w:lvl w:ilvl="0">
-      <w:start w:val="1"/>
-      <w:numFmt w:val="bullet"/>
-      <w:lvlText w:val="•"/>
-      <w:lvlJc w:val="left"/>
-      <w:pPr>
-        <w:ind w:left="720" w:hanging="360"/>
-      </w:pPr>
-    </w:lvl>
-    <w:lvl w:ilvl="1">
-      <w:start w:val="1"/>
-      <w:numFmt w:val="bullet"/>
-      <w:lvlText w:val="◦"/>
-      <w:lvlJc w:val="left"/>
-      <w:pPr>
-        <w:ind w:left="1440" w:hanging="360"/>
-      </w:pPr>
-    </w:lvl>
-    <w:lvl w:ilvl="2">
-      <w:start w:val="1"/>
-      <w:numFmt w:val="bullet"/>
-      <w:lvlText w:val="▪"/>
-      <w:lvlJc w:val="left"/>
-      <w:pPr>
-        <w:ind w:left="2160" w:hanging="360"/>
-      </w:pPr>
-    </w:lvl>
-    <w:lvl w:ilvl="3">
-      <w:start w:val="1"/>
-      <w:numFmt w:val="bullet"/>
-      <w:lvlText w:val="•"/>
-      <w:lvlJc w:val="left"/>
-      <w:pPr>
-        <w:ind w:left="2880" w:hanging="360"/>
-      </w:pPr>
-    </w:lvl>
-    <w:lvl w:ilvl="4">
-      <w:start w:val="1"/>
-      <w:numFmt w:val="bullet"/>
-      <w:lvlText w:val="◦"/>
-      <w:lvlJc w:val="left"/>
-      <w:pPr>
-        <w:ind w:left="3600" w:hanging="360"/>
-      </w:pPr>
-    </w:lvl>
-    <w:lvl w:ilvl="5">
-      <w:start w:val="1"/>
-      <w:numFmt w:val="bullet"/>
-      <w:lvlText w:val="▪"/>
-      <w:lvlJc w:val="left"/>
-      <w:pPr>
-        <w:ind w:left="4320" w:hanging="360"/>
-      </w:pPr>
-    </w:lvl>
-    <w:lvl w:ilvl="6">
-      <w:start w:val="1"/>
-      <w:numFmt w:val="bullet"/>
-      <w:lvlText w:val="•"/>
-      <w:lvlJc w:val="left"/>
-      <w:pPr>
-        <w:ind w:left="5040" w:hanging="360"/>
-      </w:pPr>
-    </w:lvl>
-    <w:lvl w:ilvl="7">
-      <w:start w:val="1"/>
-      <w:numFmt w:val="bullet"/>
-      <w:lvlText w:val="◦"/>
-      <w:lvlJc w:val="left"/>
-      <w:pPr>
-        <w:ind w:left="5760" w:hanging="360"/>
-      </w:pPr>
-    </w:lvl>
-    <w:lvl w:ilvl="8">
-      <w:start w:val="1"/>
-      <w:numFmt w:val="bullet"/>
-      <w:lvlText w:val="▪"/>
-      <w:lvlJc w:val="left"/>
-      <w:pPr>
-        <w:ind w:left="6480" w:hanging="360"/>
-      </w:pPr>
-    </w:lvl>
-  </w:abstractNum>
-  <w:abstractNum w:abstractNumId="21">
-    <w:multiLevelType w:val="hybridMultilevel"/>
-    <w:lvl w:ilvl="0">
-      <w:start w:val="1"/>
-      <w:numFmt w:val="bullet"/>
-      <w:lvlText w:val="•"/>
-      <w:lvlJc w:val="left"/>
-      <w:pPr>
-        <w:ind w:left="720" w:hanging="360"/>
-      </w:pPr>
-    </w:lvl>
-    <w:lvl w:ilvl="1">
-      <w:start w:val="1"/>
-      <w:numFmt w:val="bullet"/>
-      <w:lvlText w:val="◦"/>
-      <w:lvlJc w:val="left"/>
-      <w:pPr>
-        <w:ind w:left="1440" w:hanging="360"/>
-      </w:pPr>
-    </w:lvl>
-    <w:lvl w:ilvl="2">
-      <w:start w:val="1"/>
-      <w:numFmt w:val="bullet"/>
-      <w:lvlText w:val="▪"/>
-      <w:lvlJc w:val="left"/>
-      <w:pPr>
-        <w:ind w:left="2160" w:hanging="360"/>
-      </w:pPr>
-    </w:lvl>
-    <w:lvl w:ilvl="3">
-      <w:start w:val="1"/>
-      <w:numFmt w:val="bullet"/>
-      <w:lvlText w:val="•"/>
-      <w:lvlJc w:val="left"/>
-      <w:pPr>
-        <w:ind w:left="2880" w:hanging="360"/>
-      </w:pPr>
-    </w:lvl>
-    <w:lvl w:ilvl="4">
-      <w:start w:val="1"/>
-      <w:numFmt w:val="bullet"/>
-      <w:lvlText w:val="◦"/>
-      <w:lvlJc w:val="left"/>
-      <w:pPr>
-        <w:ind w:left="3600" w:hanging="360"/>
-      </w:pPr>
-    </w:lvl>
-    <w:lvl w:ilvl="5">
-      <w:start w:val="1"/>
-      <w:numFmt w:val="bullet"/>
-      <w:lvlText w:val="▪"/>
-      <w:lvlJc w:val="left"/>
-      <w:pPr>
-        <w:ind w:left="4320" w:hanging="360"/>
-      </w:pPr>
-    </w:lvl>
-    <w:lvl w:ilvl="6">
-      <w:start w:val="1"/>
-      <w:numFmt w:val="bullet"/>
-      <w:lvlText w:val="•"/>
-      <w:lvlJc w:val="left"/>
-      <w:pPr>
-        <w:ind w:left="5040" w:hanging="360"/>
-      </w:pPr>
-    </w:lvl>
-    <w:lvl w:ilvl="7">
-      <w:start w:val="1"/>
-      <w:numFmt w:val="bullet"/>
-      <w:lvlText w:val="◦"/>
-      <w:lvlJc w:val="left"/>
-      <w:pPr>
-        <w:ind w:left="5760" w:hanging="360"/>
-      </w:pPr>
-    </w:lvl>
-    <w:lvl w:ilvl="8">
-      <w:start w:val="1"/>
-      <w:numFmt w:val="bullet"/>
-      <w:lvlText w:val="▪"/>
-      <w:lvlJc w:val="left"/>
-      <w:pPr>
-        <w:ind w:left="6480" w:hanging="360"/>
-      </w:pPr>
-    </w:lvl>
-  </w:abstractNum>
-  <w:abstractNum w:abstractNumId="22">
-    <w:multiLevelType w:val="hybridMultilevel"/>
-    <w:lvl w:ilvl="0">
-      <w:start w:val="1"/>
-      <w:numFmt w:val="bullet"/>
-      <w:lvlText w:val="•"/>
-      <w:lvlJc w:val="left"/>
-      <w:pPr>
-        <w:ind w:left="720" w:hanging="360"/>
-      </w:pPr>
-    </w:lvl>
-    <w:lvl w:ilvl="1">
-      <w:start w:val="1"/>
-      <w:numFmt w:val="bullet"/>
-      <w:lvlText w:val="◦"/>
-      <w:lvlJc w:val="left"/>
-      <w:pPr>
-        <w:ind w:left="1440" w:hanging="360"/>
-      </w:pPr>
-    </w:lvl>
-    <w:lvl w:ilvl="2">
-      <w:start w:val="1"/>
-      <w:numFmt w:val="bullet"/>
-      <w:lvlText w:val="▪"/>
-      <w:lvlJc w:val="left"/>
-      <w:pPr>
-        <w:ind w:left="2160" w:hanging="360"/>
-      </w:pPr>
-    </w:lvl>
-    <w:lvl w:ilvl="3">
-      <w:start w:val="1"/>
-      <w:numFmt w:val="bullet"/>
-      <w:lvlText w:val="•"/>
-      <w:lvlJc w:val="left"/>
-      <w:pPr>
-        <w:ind w:left="2880" w:hanging="360"/>
-      </w:pPr>
-    </w:lvl>
-    <w:lvl w:ilvl="4">
-      <w:start w:val="1"/>
-      <w:numFmt w:val="bullet"/>
-      <w:lvlText w:val="◦"/>
-      <w:lvlJc w:val="left"/>
-      <w:pPr>
-        <w:ind w:left="3600" w:hanging="360"/>
-      </w:pPr>
-    </w:lvl>
-    <w:lvl w:ilvl="5">
-      <w:start w:val="1"/>
-      <w:numFmt w:val="bullet"/>
-      <w:lvlText w:val="▪"/>
-      <w:lvlJc w:val="left"/>
-      <w:pPr>
-        <w:ind w:left="4320" w:hanging="360"/>
-      </w:pPr>
-    </w:lvl>
-    <w:lvl w:ilvl="6">
-      <w:start w:val="1"/>
-      <w:numFmt w:val="bullet"/>
-      <w:lvlText w:val="•"/>
-      <w:lvlJc w:val="left"/>
-      <w:pPr>
-        <w:ind w:left="5040" w:hanging="360"/>
-      </w:pPr>
-    </w:lvl>
-    <w:lvl w:ilvl="7">
-      <w:start w:val="1"/>
-      <w:numFmt w:val="bullet"/>
-      <w:lvlText w:val="◦"/>
-      <w:lvlJc w:val="left"/>
-      <w:pPr>
-        <w:ind w:left="5760" w:hanging="360"/>
-      </w:pPr>
-    </w:lvl>
-    <w:lvl w:ilvl="8">
-      <w:start w:val="1"/>
-      <w:numFmt w:val="bullet"/>
-      <w:lvlText w:val="▪"/>
-      <w:lvlJc w:val="left"/>
-      <w:pPr>
-        <w:ind w:left="6480" w:hanging="360"/>
-      </w:pPr>
-    </w:lvl>
-  </w:abstractNum>
-  <w:abstractNum w:abstractNumId="23">
-    <w:multiLevelType w:val="hybridMultilevel"/>
-    <w:lvl w:ilvl="0">
-      <w:start w:val="1"/>
-      <w:numFmt w:val="decimal"/>
-      <w:lvlText w:val="%1."/>
-      <w:lvlJc w:val="left"/>
-      <w:pPr>
-        <w:ind w:left="720" w:hanging="360"/>
-      </w:pPr>
-    </w:lvl>
-    <w:lvl w:ilvl="1">
-      <w:start w:val="1"/>
-      <w:numFmt w:val="lowerLetter"/>
-      <w:lvlText w:val="%2."/>
-      <w:lvlJc w:val="left"/>
-      <w:pPr>
-        <w:ind w:left="1440" w:hanging="360"/>
-      </w:pPr>
-    </w:lvl>
-    <w:lvl w:ilvl="2">
-      <w:start w:val="1"/>
-      <w:numFmt w:val="lowerRoman"/>
-      <w:lvlText w:val="%3."/>
-      <w:lvlJc w:val="left"/>
-      <w:pPr>
-        <w:ind w:left="2160" w:hanging="360"/>
-      </w:pPr>
-    </w:lvl>
-    <w:lvl w:ilvl="3">
-      <w:start w:val="1"/>
-      <w:numFmt w:val="decimal"/>
-      <w:lvlText w:val="%4."/>
-      <w:lvlJc w:val="left"/>
-      <w:pPr>
-        <w:ind w:left="2880" w:hanging="360"/>
-      </w:pPr>
-    </w:lvl>
-    <w:lvl w:ilvl="4">
-      <w:start w:val="1"/>
-      <w:numFmt w:val="lowerLetter"/>
-      <w:lvlText w:val="%5."/>
-      <w:lvlJc w:val="left"/>
-      <w:pPr>
-        <w:ind w:left="3600" w:hanging="360"/>
-      </w:pPr>
-    </w:lvl>
-    <w:lvl w:ilvl="5">
-      <w:start w:val="1"/>
-      <w:numFmt w:val="lowerRoman"/>
-      <w:lvlText w:val="%6."/>
-      <w:lvlJc w:val="left"/>
-      <w:pPr>
-        <w:ind w:left="4320" w:hanging="360"/>
-      </w:pPr>
-    </w:lvl>
-    <w:lvl w:ilvl="6">
-      <w:start w:val="1"/>
-      <w:numFmt w:val="decimal"/>
-      <w:lvlText w:val="%7."/>
-      <w:lvlJc w:val="left"/>
-      <w:pPr>
-        <w:ind w:left="5040" w:hanging="360"/>
-      </w:pPr>
-    </w:lvl>
-    <w:lvl w:ilvl="7">
-      <w:start w:val="1"/>
-      <w:numFmt w:val="lowerLetter"/>
-      <w:lvlText w:val="%8."/>
-      <w:lvlJc w:val="left"/>
-      <w:pPr>
-        <w:ind w:left="5760" w:hanging="360"/>
-      </w:pPr>
-    </w:lvl>
-    <w:lvl w:ilvl="8">
-      <w:start w:val="1"/>
-      <w:numFmt w:val="lowerRoman"/>
-      <w:lvlText w:val="%9."/>
-      <w:lvlJc w:val="left"/>
-      <w:pPr>
-        <w:ind w:left="6480" w:hanging="360"/>
-      </w:pPr>
-    </w:lvl>
-  </w:abstractNum>
-  <w:abstractNum w:abstractNumId="24">
-    <w:multiLevelType w:val="hybridMultilevel"/>
-    <w:lvl w:ilvl="0">
-      <w:start w:val="1"/>
-      <w:numFmt w:val="bullet"/>
-      <w:lvlText w:val="•"/>
-      <w:lvlJc w:val="left"/>
-      <w:pPr>
-        <w:ind w:left="720" w:hanging="360"/>
-      </w:pPr>
-    </w:lvl>
-    <w:lvl w:ilvl="1">
-      <w:start w:val="1"/>
-      <w:numFmt w:val="bullet"/>
-      <w:lvlText w:val="◦"/>
-      <w:lvlJc w:val="left"/>
-      <w:pPr>
-        <w:ind w:left="1440" w:hanging="360"/>
-      </w:pPr>
-    </w:lvl>
-    <w:lvl w:ilvl="2">
-      <w:start w:val="1"/>
-      <w:numFmt w:val="bullet"/>
-      <w:lvlText w:val="▪"/>
-      <w:lvlJc w:val="left"/>
-      <w:pPr>
-        <w:ind w:left="2160" w:hanging="360"/>
-      </w:pPr>
-    </w:lvl>
-    <w:lvl w:ilvl="3">
-      <w:start w:val="1"/>
-      <w:numFmt w:val="bullet"/>
-      <w:lvlText w:val="•"/>
-      <w:lvlJc w:val="left"/>
-      <w:pPr>
-        <w:ind w:left="2880" w:hanging="360"/>
-      </w:pPr>
-    </w:lvl>
-    <w:lvl w:ilvl="4">
-      <w:start w:val="1"/>
-      <w:numFmt w:val="bullet"/>
-      <w:lvlText w:val="◦"/>
-      <w:lvlJc w:val="left"/>
-      <w:pPr>
-        <w:ind w:left="3600" w:hanging="360"/>
-      </w:pPr>
-    </w:lvl>
-    <w:lvl w:ilvl="5">
-      <w:start w:val="1"/>
-      <w:numFmt w:val="bullet"/>
-      <w:lvlText w:val="▪"/>
-      <w:lvlJc w:val="left"/>
-      <w:pPr>
-        <w:ind w:left="4320" w:hanging="360"/>
-      </w:pPr>
-    </w:lvl>
-    <w:lvl w:ilvl="6">
-      <w:start w:val="1"/>
-      <w:numFmt w:val="bullet"/>
-      <w:lvlText w:val="•"/>
-      <w:lvlJc w:val="left"/>
-      <w:pPr>
-        <w:ind w:left="5040" w:hanging="360"/>
-      </w:pPr>
-    </w:lvl>
-    <w:lvl w:ilvl="7">
-      <w:start w:val="1"/>
-      <w:numFmt w:val="bullet"/>
-      <w:lvlText w:val="◦"/>
-      <w:lvlJc w:val="left"/>
-      <w:pPr>
-        <w:ind w:left="5760" w:hanging="360"/>
-      </w:pPr>
-    </w:lvl>
-    <w:lvl w:ilvl="8">
-      <w:start w:val="1"/>
-      <w:numFmt w:val="bullet"/>
-      <w:lvlText w:val="▪"/>
-      <w:lvlJc w:val="left"/>
-      <w:pPr>
-        <w:ind w:left="6480" w:hanging="360"/>
-      </w:pPr>
-    </w:lvl>
-  </w:abstractNum>
-  <w:abstractNum w:abstractNumId="25">
-    <w:multiLevelType w:val="hybridMultilevel"/>
-    <w:lvl w:ilvl="0">
-      <w:start w:val="1"/>
-      <w:numFmt w:val="bullet"/>
-      <w:lvlText w:val="•"/>
-      <w:lvlJc w:val="left"/>
-      <w:pPr>
-        <w:ind w:left="720" w:hanging="360"/>
-      </w:pPr>
-    </w:lvl>
-    <w:lvl w:ilvl="1">
-      <w:start w:val="1"/>
-      <w:numFmt w:val="bullet"/>
-      <w:lvlText w:val="◦"/>
-      <w:lvlJc w:val="left"/>
-      <w:pPr>
-        <w:ind w:left="1440" w:hanging="360"/>
-      </w:pPr>
-    </w:lvl>
-    <w:lvl w:ilvl="2">
-      <w:start w:val="1"/>
-      <w:numFmt w:val="bullet"/>
-      <w:lvlText w:val="▪"/>
-      <w:lvlJc w:val="left"/>
-      <w:pPr>
-        <w:ind w:left="2160" w:hanging="360"/>
-      </w:pPr>
-    </w:lvl>
-    <w:lvl w:ilvl="3">
-      <w:start w:val="1"/>
-      <w:numFmt w:val="bullet"/>
-      <w:lvlText w:val="•"/>
-      <w:lvlJc w:val="left"/>
-      <w:pPr>
-        <w:ind w:left="2880" w:hanging="360"/>
-      </w:pPr>
-    </w:lvl>
-    <w:lvl w:ilvl="4">
-      <w:start w:val="1"/>
-      <w:numFmt w:val="bullet"/>
-      <w:lvlText w:val="◦"/>
-      <w:lvlJc w:val="left"/>
-      <w:pPr>
-        <w:ind w:left="3600" w:hanging="360"/>
-      </w:pPr>
-    </w:lvl>
-    <w:lvl w:ilvl="5">
-      <w:start w:val="1"/>
-      <w:numFmt w:val="bullet"/>
-      <w:lvlText w:val="▪"/>
-      <w:lvlJc w:val="left"/>
-      <w:pPr>
-        <w:ind w:left="4320" w:hanging="360"/>
-      </w:pPr>
-    </w:lvl>
-    <w:lvl w:ilvl="6">
-      <w:start w:val="1"/>
-      <w:numFmt w:val="bullet"/>
-      <w:lvlText w:val="•"/>
-      <w:lvlJc w:val="left"/>
-      <w:pPr>
-        <w:ind w:left="5040" w:hanging="360"/>
-      </w:pPr>
-    </w:lvl>
-    <w:lvl w:ilvl="7">
-      <w:start w:val="1"/>
-      <w:numFmt w:val="bullet"/>
-      <w:lvlText w:val="◦"/>
-      <w:lvlJc w:val="left"/>
-      <w:pPr>
-        <w:ind w:left="5760" w:hanging="360"/>
-      </w:pPr>
-    </w:lvl>
-    <w:lvl w:ilvl="8">
-      <w:start w:val="1"/>
-      <w:numFmt w:val="bullet"/>
-      <w:lvlText w:val="▪"/>
-      <w:lvlJc w:val="left"/>
-      <w:pPr>
-        <w:ind w:left="6480" w:hanging="360"/>
-      </w:pPr>
     </w:lvl>
   </w:abstractNum>
   <w:num w:numId="1" w16cid:durableId="536310393">
+    <w:abstractNumId w:val="17"/>
+  </w:num>
+  <w:num w:numId="2" w16cid:durableId="1757241914">
+    <w:abstractNumId w:val="23"/>
+  </w:num>
+  <w:num w:numId="3" w16cid:durableId="1861815693">
+    <w:abstractNumId w:val="25"/>
+  </w:num>
+  <w:num w:numId="4" w16cid:durableId="332073122">
+    <w:abstractNumId w:val="14"/>
+  </w:num>
+  <w:num w:numId="5" w16cid:durableId="630213257">
     <w:abstractNumId w:val="9"/>
   </w:num>
-  <w:num w:numId="2" w16cid:durableId="1757241914">
-    <w:abstractNumId w:val="13"/>
-  </w:num>
-  <w:num w:numId="3" w16cid:durableId="1861815693">
-    <w:abstractNumId w:val="14"/>
-  </w:num>
-  <w:num w:numId="4" w16cid:durableId="332073122">
-    <w:abstractNumId w:val="7"/>
-  </w:num>
-  <w:num w:numId="5" w16cid:durableId="630213257">
-    <w:abstractNumId w:val="5"/>
-  </w:num>
   <w:num w:numId="6" w16cid:durableId="465320605">
-    <w:abstractNumId w:val="12"/>
+    <w:abstractNumId w:val="22"/>
   </w:num>
   <w:num w:numId="7" w16cid:durableId="1972858948">
-    <w:abstractNumId w:val="10"/>
+    <w:abstractNumId w:val="19"/>
   </w:num>
   <w:num w:numId="8" w16cid:durableId="30107595">
-    <w:abstractNumId w:val="11"/>
+    <w:abstractNumId w:val="21"/>
   </w:num>
   <w:num w:numId="9" w16cid:durableId="937174200">
     <w:abstractNumId w:val="0"/>
   </w:num>
   <w:num w:numId="10" w16cid:durableId="1921475466">
-    <w:abstractNumId w:val="6"/>
+    <w:abstractNumId w:val="12"/>
   </w:num>
   <w:num w:numId="11" w16cid:durableId="1881435237">
     <w:abstractNumId w:val="2"/>
   </w:num>
   <w:num w:numId="12" w16cid:durableId="406464161">
-    <w:abstractNumId w:val="4"/>
+    <w:abstractNumId w:val="8"/>
   </w:num>
   <w:num w:numId="13" w16cid:durableId="1084568163">
     <w:abstractNumId w:val="1"/>
   </w:num>
   <w:num w:numId="14" w16cid:durableId="2055501520">
-    <w:abstractNumId w:val="8"/>
+    <w:abstractNumId w:val="16"/>
   </w:num>
   <w:num w:numId="15" w16cid:durableId="1873153994">
+    <w:abstractNumId w:val="4"/>
+  </w:num>
+  <w:num w:numId="16" w16cid:durableId="1792749315">
+    <w:abstractNumId w:val="7"/>
+  </w:num>
+  <w:num w:numId="17" w16cid:durableId="630213217">
     <w:abstractNumId w:val="3"/>
   </w:num>
-  <w:num w:numId="16">
+  <w:num w:numId="18" w16cid:durableId="556281203">
+    <w:abstractNumId w:val="5"/>
+  </w:num>
+  <w:num w:numId="19" w16cid:durableId="1786848154">
+    <w:abstractNumId w:val="18"/>
+  </w:num>
+  <w:num w:numId="20" w16cid:durableId="86776520">
+    <w:abstractNumId w:val="6"/>
+  </w:num>
+  <w:num w:numId="21" w16cid:durableId="163017824">
+    <w:abstractNumId w:val="24"/>
+  </w:num>
+  <w:num w:numId="22" w16cid:durableId="1715929597">
+    <w:abstractNumId w:val="10"/>
+  </w:num>
+  <w:num w:numId="23" w16cid:durableId="1360084349">
+    <w:abstractNumId w:val="20"/>
+  </w:num>
+  <w:num w:numId="24" w16cid:durableId="79496377">
     <w:abstractNumId w:val="15"/>
   </w:num>
-  <w:num w:numId="17">
-    <w:abstractNumId w:val="16"/>
+  <w:num w:numId="25" w16cid:durableId="601184753">
+    <w:abstractNumId w:val="13"/>
   </w:num>
-  <w:num w:numId="18">
-    <w:abstractNumId w:val="17"/>
-  </w:num>
-  <w:num w:numId="19">
-    <w:abstractNumId w:val="18"/>
-  </w:num>
-  <w:num w:numId="20">
-    <w:abstractNumId w:val="19"/>
-  </w:num>
-  <w:num w:numId="21">
-    <w:abstractNumId w:val="20"/>
-  </w:num>
-  <w:num w:numId="22">
-    <w:abstractNumId w:val="21"/>
-  </w:num>
-  <w:num w:numId="23">
-    <w:abstractNumId w:val="22"/>
-  </w:num>
-  <w:num w:numId="24">
-    <w:abstractNumId w:val="23"/>
-  </w:num>
-  <w:num w:numId="25">
-    <w:abstractNumId w:val="24"/>
-  </w:num>
-  <w:num w:numId="26">
-    <w:abstractNumId w:val="25"/>
+  <w:num w:numId="26" w16cid:durableId="1320502348">
+    <w:abstractNumId w:val="11"/>
   </w:num>
   <w:numIdMacAtCleanup w:val="15"/>
 </w:numbering>
@@ -7092,7 +7427,7 @@
   <w:docDefaults>
     <w:rPrDefault>
       <w:rPr>
-        <w:rFonts w:asciiTheme="minorHAnsi" w:hAnsiTheme="minorHAnsi" w:eastAsiaTheme="minorHAnsi" w:cstheme="minorBidi"/>
+        <w:rFonts w:asciiTheme="minorHAnsi" w:eastAsiaTheme="minorHAnsi" w:hAnsiTheme="minorHAnsi" w:cstheme="minorBidi"/>
         <w:kern w:val="2"/>
         <w:sz w:val="30"/>
         <w:szCs w:val="30"/>
@@ -7109,14 +7444,14 @@
   <w:latentStyles w:defLockedState="0" w:defUIPriority="99" w:defSemiHidden="0" w:defUnhideWhenUsed="0" w:defQFormat="0" w:count="376">
     <w:lsdException w:name="Normal" w:uiPriority="0" w:qFormat="1"/>
     <w:lsdException w:name="heading 1" w:uiPriority="9" w:qFormat="1"/>
-    <w:lsdException w:name="heading 2" w:uiPriority="9" w:semiHidden="1" w:unhideWhenUsed="1" w:qFormat="1"/>
-    <w:lsdException w:name="heading 3" w:uiPriority="9" w:semiHidden="1" w:unhideWhenUsed="1" w:qFormat="1"/>
-    <w:lsdException w:name="heading 4" w:uiPriority="9" w:semiHidden="1" w:unhideWhenUsed="1" w:qFormat="1"/>
-    <w:lsdException w:name="heading 5" w:uiPriority="9" w:semiHidden="1" w:unhideWhenUsed="1" w:qFormat="1"/>
-    <w:lsdException w:name="heading 6" w:uiPriority="9" w:semiHidden="1" w:unhideWhenUsed="1" w:qFormat="1"/>
-    <w:lsdException w:name="heading 7" w:uiPriority="9" w:semiHidden="1" w:unhideWhenUsed="1" w:qFormat="1"/>
-    <w:lsdException w:name="heading 8" w:uiPriority="9" w:semiHidden="1" w:unhideWhenUsed="1" w:qFormat="1"/>
-    <w:lsdException w:name="heading 9" w:uiPriority="9" w:semiHidden="1" w:unhideWhenUsed="1" w:qFormat="1"/>
+    <w:lsdException w:name="heading 2" w:semiHidden="1" w:uiPriority="9" w:unhideWhenUsed="1" w:qFormat="1"/>
+    <w:lsdException w:name="heading 3" w:semiHidden="1" w:uiPriority="9" w:unhideWhenUsed="1" w:qFormat="1"/>
+    <w:lsdException w:name="heading 4" w:semiHidden="1" w:uiPriority="9" w:unhideWhenUsed="1" w:qFormat="1"/>
+    <w:lsdException w:name="heading 5" w:semiHidden="1" w:uiPriority="9" w:unhideWhenUsed="1" w:qFormat="1"/>
+    <w:lsdException w:name="heading 6" w:semiHidden="1" w:uiPriority="9" w:unhideWhenUsed="1" w:qFormat="1"/>
+    <w:lsdException w:name="heading 7" w:semiHidden="1" w:uiPriority="9" w:unhideWhenUsed="1" w:qFormat="1"/>
+    <w:lsdException w:name="heading 8" w:semiHidden="1" w:uiPriority="9" w:unhideWhenUsed="1" w:qFormat="1"/>
+    <w:lsdException w:name="heading 9" w:semiHidden="1" w:uiPriority="9" w:unhideWhenUsed="1" w:qFormat="1"/>
     <w:lsdException w:name="index 1" w:semiHidden="1" w:unhideWhenUsed="1"/>
     <w:lsdException w:name="index 2" w:semiHidden="1" w:unhideWhenUsed="1"/>
     <w:lsdException w:name="index 3" w:semiHidden="1" w:unhideWhenUsed="1"/>
@@ -7126,22 +7461,22 @@
     <w:lsdException w:name="index 7" w:semiHidden="1" w:unhideWhenUsed="1"/>
     <w:lsdException w:name="index 8" w:semiHidden="1" w:unhideWhenUsed="1"/>
     <w:lsdException w:name="index 9" w:semiHidden="1" w:unhideWhenUsed="1"/>
-    <w:lsdException w:name="toc 1" w:uiPriority="39" w:semiHidden="1" w:unhideWhenUsed="1"/>
-    <w:lsdException w:name="toc 2" w:uiPriority="39" w:semiHidden="1" w:unhideWhenUsed="1"/>
-    <w:lsdException w:name="toc 3" w:uiPriority="39" w:semiHidden="1" w:unhideWhenUsed="1"/>
-    <w:lsdException w:name="toc 4" w:uiPriority="39" w:semiHidden="1" w:unhideWhenUsed="1"/>
-    <w:lsdException w:name="toc 5" w:uiPriority="39" w:semiHidden="1" w:unhideWhenUsed="1"/>
-    <w:lsdException w:name="toc 6" w:uiPriority="39" w:semiHidden="1" w:unhideWhenUsed="1"/>
-    <w:lsdException w:name="toc 7" w:uiPriority="39" w:semiHidden="1" w:unhideWhenUsed="1"/>
-    <w:lsdException w:name="toc 8" w:uiPriority="39" w:semiHidden="1" w:unhideWhenUsed="1"/>
-    <w:lsdException w:name="toc 9" w:uiPriority="39" w:semiHidden="1" w:unhideWhenUsed="1"/>
+    <w:lsdException w:name="toc 1" w:semiHidden="1" w:uiPriority="39" w:unhideWhenUsed="1"/>
+    <w:lsdException w:name="toc 2" w:semiHidden="1" w:uiPriority="39" w:unhideWhenUsed="1"/>
+    <w:lsdException w:name="toc 3" w:semiHidden="1" w:uiPriority="39" w:unhideWhenUsed="1"/>
+    <w:lsdException w:name="toc 4" w:semiHidden="1" w:uiPriority="39" w:unhideWhenUsed="1"/>
+    <w:lsdException w:name="toc 5" w:semiHidden="1" w:uiPriority="39" w:unhideWhenUsed="1"/>
+    <w:lsdException w:name="toc 6" w:semiHidden="1" w:uiPriority="39" w:unhideWhenUsed="1"/>
+    <w:lsdException w:name="toc 7" w:semiHidden="1" w:uiPriority="39" w:unhideWhenUsed="1"/>
+    <w:lsdException w:name="toc 8" w:semiHidden="1" w:uiPriority="39" w:unhideWhenUsed="1"/>
+    <w:lsdException w:name="toc 9" w:semiHidden="1" w:uiPriority="39" w:unhideWhenUsed="1"/>
     <w:lsdException w:name="Normal Indent" w:semiHidden="1" w:unhideWhenUsed="1"/>
     <w:lsdException w:name="footnote text" w:semiHidden="1" w:unhideWhenUsed="1"/>
     <w:lsdException w:name="annotation text" w:semiHidden="1" w:unhideWhenUsed="1"/>
     <w:lsdException w:name="header" w:semiHidden="1" w:unhideWhenUsed="1"/>
     <w:lsdException w:name="footer" w:semiHidden="1" w:unhideWhenUsed="1"/>
     <w:lsdException w:name="index heading" w:semiHidden="1" w:unhideWhenUsed="1"/>
-    <w:lsdException w:name="caption" w:uiPriority="35" w:semiHidden="1" w:unhideWhenUsed="1" w:qFormat="1"/>
+    <w:lsdException w:name="caption" w:semiHidden="1" w:uiPriority="35" w:unhideWhenUsed="1" w:qFormat="1"/>
     <w:lsdException w:name="table of figures" w:semiHidden="1" w:unhideWhenUsed="1"/>
     <w:lsdException w:name="envelope address" w:semiHidden="1" w:unhideWhenUsed="1"/>
     <w:lsdException w:name="envelope return" w:semiHidden="1" w:unhideWhenUsed="1"/>
@@ -7172,7 +7507,7 @@
     <w:lsdException w:name="Title" w:uiPriority="10" w:qFormat="1"/>
     <w:lsdException w:name="Closing" w:semiHidden="1" w:unhideWhenUsed="1"/>
     <w:lsdException w:name="Signature" w:semiHidden="1" w:unhideWhenUsed="1"/>
-    <w:lsdException w:name="Default Paragraph Font" w:uiPriority="1" w:semiHidden="1" w:unhideWhenUsed="1"/>
+    <w:lsdException w:name="Default Paragraph Font" w:semiHidden="1" w:uiPriority="1" w:unhideWhenUsed="1"/>
     <w:lsdException w:name="Body Text" w:semiHidden="1" w:unhideWhenUsed="1"/>
     <w:lsdException w:name="Body Text Indent" w:semiHidden="1" w:unhideWhenUsed="1"/>
     <w:lsdException w:name="List Continue" w:semiHidden="1" w:unhideWhenUsed="1"/>
@@ -7372,8 +7707,8 @@
     <w:lsdException w:name="Subtle Reference" w:uiPriority="31" w:qFormat="1"/>
     <w:lsdException w:name="Intense Reference" w:uiPriority="32" w:qFormat="1"/>
     <w:lsdException w:name="Book Title" w:uiPriority="33" w:qFormat="1"/>
-    <w:lsdException w:name="Bibliography" w:uiPriority="37" w:semiHidden="1" w:unhideWhenUsed="1"/>
-    <w:lsdException w:name="TOC Heading" w:uiPriority="39" w:semiHidden="1" w:unhideWhenUsed="1" w:qFormat="1"/>
+    <w:lsdException w:name="Bibliography" w:semiHidden="1" w:uiPriority="37" w:unhideWhenUsed="1"/>
+    <w:lsdException w:name="TOC Heading" w:semiHidden="1" w:uiPriority="39" w:unhideWhenUsed="1" w:qFormat="1"/>
     <w:lsdException w:name="Plain Table 1" w:uiPriority="41"/>
     <w:lsdException w:name="Plain Table 2" w:uiPriority="42"/>
     <w:lsdException w:name="Plain Table 3" w:uiPriority="43"/>
@@ -7484,11 +7819,11 @@
     <w:lsdException w:name="Unresolved Mention" w:semiHidden="1" w:unhideWhenUsed="1"/>
     <w:lsdException w:name="Smart Link" w:semiHidden="1" w:unhideWhenUsed="1"/>
   </w:latentStyles>
-  <w:style w:type="paragraph" w:styleId="Normal" w:default="1">
+  <w:style w:type="paragraph" w:default="1" w:styleId="Normal">
     <w:name w:val="Normal"/>
     <w:qFormat/>
     <w:rPr>
-      <w:rFonts w:ascii="Cordia New" w:hAnsi="Cordia New" w:eastAsia="Cordia New" w:cs="Cordia New"/>
+      <w:rFonts w:ascii="Cordia New" w:eastAsia="Cordia New" w:hAnsi="Cordia New" w:cs="Cordia New"/>
     </w:rPr>
   </w:style>
   <w:style w:type="paragraph" w:styleId="Heading1">
@@ -7506,7 +7841,7 @@
       <w:outlineLvl w:val="0"/>
     </w:pPr>
     <w:rPr>
-      <w:rFonts w:asciiTheme="majorHAnsi" w:hAnsiTheme="majorHAnsi" w:eastAsiaTheme="majorEastAsia" w:cstheme="majorBidi"/>
+      <w:rFonts w:asciiTheme="majorHAnsi" w:eastAsiaTheme="majorEastAsia" w:hAnsiTheme="majorHAnsi" w:cstheme="majorBidi"/>
       <w:color w:val="0F4761" w:themeColor="accent1" w:themeShade="BF"/>
       <w:sz w:val="40"/>
       <w:szCs w:val="50"/>
@@ -7528,7 +7863,7 @@
       <w:outlineLvl w:val="1"/>
     </w:pPr>
     <w:rPr>
-      <w:rFonts w:asciiTheme="majorHAnsi" w:hAnsiTheme="majorHAnsi" w:eastAsiaTheme="majorEastAsia" w:cstheme="majorBidi"/>
+      <w:rFonts w:asciiTheme="majorHAnsi" w:eastAsiaTheme="majorEastAsia" w:hAnsiTheme="majorHAnsi" w:cstheme="majorBidi"/>
       <w:color w:val="0F4761" w:themeColor="accent1" w:themeShade="BF"/>
       <w:sz w:val="32"/>
       <w:szCs w:val="40"/>
@@ -7688,12 +8023,12 @@
       <w:color w:val="272727" w:themeColor="text1" w:themeTint="D8"/>
     </w:rPr>
   </w:style>
-  <w:style w:type="character" w:styleId="DefaultParagraphFont" w:default="1">
+  <w:style w:type="character" w:default="1" w:styleId="DefaultParagraphFont">
     <w:name w:val="Default Paragraph Font"/>
     <w:uiPriority w:val="1"/>
     <w:unhideWhenUsed/>
   </w:style>
-  <w:style w:type="table" w:styleId="TableNormal" w:default="1">
+  <w:style w:type="table" w:default="1" w:styleId="TableNormal">
     <w:name w:val="Normal Table"/>
     <w:uiPriority w:val="99"/>
     <w:semiHidden/>
@@ -7708,39 +8043,39 @@
       </w:tblCellMar>
     </w:tblPr>
   </w:style>
-  <w:style w:type="numbering" w:styleId="NoList" w:default="1">
+  <w:style w:type="numbering" w:default="1" w:styleId="NoList">
     <w:name w:val="No List"/>
     <w:uiPriority w:val="99"/>
     <w:semiHidden/>
     <w:unhideWhenUsed/>
   </w:style>
-  <w:style w:type="character" w:styleId="Heading1Char" w:customStyle="1">
+  <w:style w:type="character" w:customStyle="1" w:styleId="Heading1Char">
     <w:name w:val="Heading 1 Char"/>
     <w:basedOn w:val="DefaultParagraphFont"/>
     <w:link w:val="Heading1"/>
     <w:uiPriority w:val="9"/>
     <w:rsid w:val="00285F3F"/>
     <w:rPr>
-      <w:rFonts w:asciiTheme="majorHAnsi" w:hAnsiTheme="majorHAnsi" w:eastAsiaTheme="majorEastAsia" w:cstheme="majorBidi"/>
+      <w:rFonts w:asciiTheme="majorHAnsi" w:eastAsiaTheme="majorEastAsia" w:hAnsiTheme="majorHAnsi" w:cstheme="majorBidi"/>
       <w:color w:val="0F4761" w:themeColor="accent1" w:themeShade="BF"/>
       <w:sz w:val="40"/>
       <w:szCs w:val="50"/>
     </w:rPr>
   </w:style>
-  <w:style w:type="character" w:styleId="Heading2Char" w:customStyle="1">
+  <w:style w:type="character" w:customStyle="1" w:styleId="Heading2Char">
     <w:name w:val="Heading 2 Char"/>
     <w:basedOn w:val="DefaultParagraphFont"/>
     <w:link w:val="Heading2"/>
     <w:uiPriority w:val="9"/>
     <w:rsid w:val="00285F3F"/>
     <w:rPr>
-      <w:rFonts w:asciiTheme="majorHAnsi" w:hAnsiTheme="majorHAnsi" w:eastAsiaTheme="majorEastAsia" w:cstheme="majorBidi"/>
+      <w:rFonts w:asciiTheme="majorHAnsi" w:eastAsiaTheme="majorEastAsia" w:hAnsiTheme="majorHAnsi" w:cstheme="majorBidi"/>
       <w:color w:val="0F4761" w:themeColor="accent1" w:themeShade="BF"/>
       <w:sz w:val="32"/>
       <w:szCs w:val="40"/>
     </w:rPr>
   </w:style>
-  <w:style w:type="character" w:styleId="Heading3Char" w:customStyle="1">
+  <w:style w:type="character" w:customStyle="1" w:styleId="Heading3Char">
     <w:name w:val="Heading 3 Char"/>
     <w:basedOn w:val="DefaultParagraphFont"/>
     <w:link w:val="Heading3"/>
@@ -7753,7 +8088,7 @@
       <w:szCs w:val="35"/>
     </w:rPr>
   </w:style>
-  <w:style w:type="character" w:styleId="Heading4Char" w:customStyle="1">
+  <w:style w:type="character" w:customStyle="1" w:styleId="Heading4Char">
     <w:name w:val="Heading 4 Char"/>
     <w:basedOn w:val="DefaultParagraphFont"/>
     <w:link w:val="Heading4"/>
@@ -7767,7 +8102,7 @@
       <w:color w:val="0F4761" w:themeColor="accent1" w:themeShade="BF"/>
     </w:rPr>
   </w:style>
-  <w:style w:type="character" w:styleId="Heading5Char" w:customStyle="1">
+  <w:style w:type="character" w:customStyle="1" w:styleId="Heading5Char">
     <w:name w:val="Heading 5 Char"/>
     <w:basedOn w:val="DefaultParagraphFont"/>
     <w:link w:val="Heading5"/>
@@ -7779,7 +8114,7 @@
       <w:color w:val="0F4761" w:themeColor="accent1" w:themeShade="BF"/>
     </w:rPr>
   </w:style>
-  <w:style w:type="character" w:styleId="Heading6Char" w:customStyle="1">
+  <w:style w:type="character" w:customStyle="1" w:styleId="Heading6Char">
     <w:name w:val="Heading 6 Char"/>
     <w:basedOn w:val="DefaultParagraphFont"/>
     <w:link w:val="Heading6"/>
@@ -7793,7 +8128,7 @@
       <w:color w:val="595959" w:themeColor="text1" w:themeTint="A6"/>
     </w:rPr>
   </w:style>
-  <w:style w:type="character" w:styleId="Heading7Char" w:customStyle="1">
+  <w:style w:type="character" w:customStyle="1" w:styleId="Heading7Char">
     <w:name w:val="Heading 7 Char"/>
     <w:basedOn w:val="DefaultParagraphFont"/>
     <w:link w:val="Heading7"/>
@@ -7805,7 +8140,7 @@
       <w:color w:val="595959" w:themeColor="text1" w:themeTint="A6"/>
     </w:rPr>
   </w:style>
-  <w:style w:type="character" w:styleId="Heading8Char" w:customStyle="1">
+  <w:style w:type="character" w:customStyle="1" w:styleId="Heading8Char">
     <w:name w:val="Heading 8 Char"/>
     <w:basedOn w:val="DefaultParagraphFont"/>
     <w:link w:val="Heading8"/>
@@ -7819,7 +8154,7 @@
       <w:color w:val="272727" w:themeColor="text1" w:themeTint="D8"/>
     </w:rPr>
   </w:style>
-  <w:style w:type="character" w:styleId="Heading9Char" w:customStyle="1">
+  <w:style w:type="character" w:customStyle="1" w:styleId="Heading9Char">
     <w:name w:val="Heading 9 Char"/>
     <w:basedOn w:val="DefaultParagraphFont"/>
     <w:link w:val="Heading9"/>
@@ -7844,21 +8179,21 @@
       <w:contextualSpacing/>
     </w:pPr>
     <w:rPr>
-      <w:rFonts w:asciiTheme="majorHAnsi" w:hAnsiTheme="majorHAnsi" w:eastAsiaTheme="majorEastAsia" w:cstheme="majorBidi"/>
+      <w:rFonts w:asciiTheme="majorHAnsi" w:eastAsiaTheme="majorEastAsia" w:hAnsiTheme="majorHAnsi" w:cstheme="majorBidi"/>
       <w:spacing w:val="-10"/>
       <w:kern w:val="28"/>
       <w:sz w:val="56"/>
       <w:szCs w:val="71"/>
     </w:rPr>
   </w:style>
-  <w:style w:type="character" w:styleId="TitleChar" w:customStyle="1">
+  <w:style w:type="character" w:customStyle="1" w:styleId="TitleChar">
     <w:name w:val="Title Char"/>
     <w:basedOn w:val="DefaultParagraphFont"/>
     <w:link w:val="Title"/>
     <w:uiPriority w:val="10"/>
     <w:rsid w:val="00285F3F"/>
     <w:rPr>
-      <w:rFonts w:asciiTheme="majorHAnsi" w:hAnsiTheme="majorHAnsi" w:eastAsiaTheme="majorEastAsia" w:cstheme="majorBidi"/>
+      <w:rFonts w:asciiTheme="majorHAnsi" w:eastAsiaTheme="majorEastAsia" w:hAnsiTheme="majorHAnsi" w:cstheme="majorBidi"/>
       <w:spacing w:val="-10"/>
       <w:kern w:val="28"/>
       <w:sz w:val="56"/>
@@ -7886,7 +8221,7 @@
       <w:szCs w:val="35"/>
     </w:rPr>
   </w:style>
-  <w:style w:type="character" w:styleId="SubtitleChar" w:customStyle="1">
+  <w:style w:type="character" w:customStyle="1" w:styleId="SubtitleChar">
     <w:name w:val="Subtitle Char"/>
     <w:basedOn w:val="DefaultParagraphFont"/>
     <w:link w:val="Subtitle"/>
@@ -7918,7 +8253,7 @@
       <w:color w:val="404040" w:themeColor="text1" w:themeTint="BF"/>
     </w:rPr>
   </w:style>
-  <w:style w:type="character" w:styleId="QuoteChar" w:customStyle="1">
+  <w:style w:type="character" w:customStyle="1" w:styleId="QuoteChar">
     <w:name w:val="Quote Char"/>
     <w:basedOn w:val="DefaultParagraphFont"/>
     <w:link w:val="Quote"/>
@@ -7963,8 +8298,8 @@
     <w:rsid w:val="00285F3F"/>
     <w:pPr>
       <w:pBdr>
-        <w:top w:val="single" w:color="0F4761" w:themeColor="accent1" w:themeShade="BF" w:sz="4" w:space="10"/>
-        <w:bottom w:val="single" w:color="0F4761" w:themeColor="accent1" w:themeShade="BF" w:sz="4" w:space="10"/>
+        <w:top w:val="single" w:sz="4" w:space="10" w:color="0F4761" w:themeColor="accent1" w:themeShade="BF"/>
+        <w:bottom w:val="single" w:sz="4" w:space="10" w:color="0F4761" w:themeColor="accent1" w:themeShade="BF"/>
       </w:pBdr>
       <w:spacing w:before="360" w:after="360"/>
       <w:ind w:left="864" w:right="864"/>
@@ -7976,7 +8311,7 @@
       <w:color w:val="0F4761" w:themeColor="accent1" w:themeShade="BF"/>
     </w:rPr>
   </w:style>
-  <w:style w:type="character" w:styleId="IntenseQuoteChar" w:customStyle="1">
+  <w:style w:type="character" w:customStyle="1" w:styleId="IntenseQuoteChar">
     <w:name w:val="Intense Quote Char"/>
     <w:basedOn w:val="DefaultParagraphFont"/>
     <w:link w:val="IntenseQuote"/>
@@ -8012,12 +8347,12 @@
     </w:pPr>
     <w:tblPr>
       <w:tblBorders>
-        <w:top w:val="single" w:color="auto" w:sz="4" w:space="0"/>
-        <w:left w:val="single" w:color="auto" w:sz="4" w:space="0"/>
-        <w:bottom w:val="single" w:color="auto" w:sz="4" w:space="0"/>
-        <w:right w:val="single" w:color="auto" w:sz="4" w:space="0"/>
-        <w:insideH w:val="single" w:color="auto" w:sz="4" w:space="0"/>
-        <w:insideV w:val="single" w:color="auto" w:sz="4" w:space="0"/>
+        <w:top w:val="single" w:sz="4" w:space="0" w:color="auto"/>
+        <w:left w:val="single" w:sz="4" w:space="0" w:color="auto"/>
+        <w:bottom w:val="single" w:sz="4" w:space="0" w:color="auto"/>
+        <w:right w:val="single" w:sz="4" w:space="0" w:color="auto"/>
+        <w:insideH w:val="single" w:sz="4" w:space="0" w:color="auto"/>
+        <w:insideV w:val="single" w:sz="4" w:space="0" w:color="auto"/>
       </w:tblBorders>
     </w:tblPr>
   </w:style>
@@ -8035,7 +8370,7 @@
     </w:tblPr>
     <w:tblStylePr w:type="firstRow">
       <w:rPr>
-        <w:rFonts w:asciiTheme="majorHAnsi" w:hAnsiTheme="majorHAnsi" w:eastAsiaTheme="majorEastAsia" w:cstheme="majorBidi"/>
+        <w:rFonts w:asciiTheme="majorHAnsi" w:eastAsiaTheme="majorEastAsia" w:hAnsiTheme="majorHAnsi" w:cstheme="majorBidi"/>
         <w:i/>
         <w:iCs/>
         <w:sz w:val="26"/>
@@ -8043,14 +8378,14 @@
       <w:tblPr/>
       <w:tcPr>
         <w:tcBorders>
-          <w:bottom w:val="single" w:color="7F7F7F" w:themeColor="text1" w:themeTint="80" w:sz="4" w:space="0"/>
+          <w:bottom w:val="single" w:sz="4" w:space="0" w:color="7F7F7F" w:themeColor="text1" w:themeTint="80"/>
         </w:tcBorders>
         <w:shd w:val="clear" w:color="auto" w:fill="FFFFFF" w:themeFill="background1"/>
       </w:tcPr>
     </w:tblStylePr>
     <w:tblStylePr w:type="lastRow">
       <w:rPr>
-        <w:rFonts w:asciiTheme="majorHAnsi" w:hAnsiTheme="majorHAnsi" w:eastAsiaTheme="majorEastAsia" w:cstheme="majorBidi"/>
+        <w:rFonts w:asciiTheme="majorHAnsi" w:eastAsiaTheme="majorEastAsia" w:hAnsiTheme="majorHAnsi" w:cstheme="majorBidi"/>
         <w:i/>
         <w:iCs/>
         <w:sz w:val="26"/>
@@ -8058,7 +8393,7 @@
       <w:tblPr/>
       <w:tcPr>
         <w:tcBorders>
-          <w:top w:val="single" w:color="7F7F7F" w:themeColor="text1" w:themeTint="80" w:sz="4" w:space="0"/>
+          <w:top w:val="single" w:sz="4" w:space="0" w:color="7F7F7F" w:themeColor="text1" w:themeTint="80"/>
         </w:tcBorders>
         <w:shd w:val="clear" w:color="auto" w:fill="FFFFFF" w:themeFill="background1"/>
       </w:tcPr>
@@ -8068,7 +8403,7 @@
         <w:jc w:val="right"/>
       </w:pPr>
       <w:rPr>
-        <w:rFonts w:asciiTheme="majorHAnsi" w:hAnsiTheme="majorHAnsi" w:eastAsiaTheme="majorEastAsia" w:cstheme="majorBidi"/>
+        <w:rFonts w:asciiTheme="majorHAnsi" w:eastAsiaTheme="majorEastAsia" w:hAnsiTheme="majorHAnsi" w:cstheme="majorBidi"/>
         <w:i/>
         <w:iCs/>
         <w:sz w:val="26"/>
@@ -8076,14 +8411,14 @@
       <w:tblPr/>
       <w:tcPr>
         <w:tcBorders>
-          <w:right w:val="single" w:color="7F7F7F" w:themeColor="text1" w:themeTint="80" w:sz="4" w:space="0"/>
+          <w:right w:val="single" w:sz="4" w:space="0" w:color="7F7F7F" w:themeColor="text1" w:themeTint="80"/>
         </w:tcBorders>
         <w:shd w:val="clear" w:color="auto" w:fill="FFFFFF" w:themeFill="background1"/>
       </w:tcPr>
     </w:tblStylePr>
     <w:tblStylePr w:type="lastCol">
       <w:rPr>
-        <w:rFonts w:asciiTheme="majorHAnsi" w:hAnsiTheme="majorHAnsi" w:eastAsiaTheme="majorEastAsia" w:cstheme="majorBidi"/>
+        <w:rFonts w:asciiTheme="majorHAnsi" w:eastAsiaTheme="majorEastAsia" w:hAnsiTheme="majorHAnsi" w:cstheme="majorBidi"/>
         <w:i/>
         <w:iCs/>
         <w:sz w:val="26"/>
@@ -8091,7 +8426,7 @@
       <w:tblPr/>
       <w:tcPr>
         <w:tcBorders>
-          <w:left w:val="single" w:color="7F7F7F" w:themeColor="text1" w:themeTint="80" w:sz="4" w:space="0"/>
+          <w:left w:val="single" w:sz="4" w:space="0" w:color="7F7F7F" w:themeColor="text1" w:themeTint="80"/>
         </w:tcBorders>
         <w:shd w:val="clear" w:color="auto" w:fill="FFFFFF" w:themeFill="background1"/>
       </w:tcPr>
@@ -8153,12 +8488,12 @@
       <w:tblStyleRowBandSize w:val="1"/>
       <w:tblStyleColBandSize w:val="1"/>
       <w:tblBorders>
-        <w:top w:val="single" w:color="999999" w:themeColor="text1" w:themeTint="66" w:sz="4" w:space="0"/>
-        <w:left w:val="single" w:color="999999" w:themeColor="text1" w:themeTint="66" w:sz="4" w:space="0"/>
-        <w:bottom w:val="single" w:color="999999" w:themeColor="text1" w:themeTint="66" w:sz="4" w:space="0"/>
-        <w:right w:val="single" w:color="999999" w:themeColor="text1" w:themeTint="66" w:sz="4" w:space="0"/>
-        <w:insideH w:val="single" w:color="999999" w:themeColor="text1" w:themeTint="66" w:sz="4" w:space="0"/>
-        <w:insideV w:val="single" w:color="999999" w:themeColor="text1" w:themeTint="66" w:sz="4" w:space="0"/>
+        <w:top w:val="single" w:sz="4" w:space="0" w:color="999999" w:themeColor="text1" w:themeTint="66"/>
+        <w:left w:val="single" w:sz="4" w:space="0" w:color="999999" w:themeColor="text1" w:themeTint="66"/>
+        <w:bottom w:val="single" w:sz="4" w:space="0" w:color="999999" w:themeColor="text1" w:themeTint="66"/>
+        <w:right w:val="single" w:sz="4" w:space="0" w:color="999999" w:themeColor="text1" w:themeTint="66"/>
+        <w:insideH w:val="single" w:sz="4" w:space="0" w:color="999999" w:themeColor="text1" w:themeTint="66"/>
+        <w:insideV w:val="single" w:sz="4" w:space="0" w:color="999999" w:themeColor="text1" w:themeTint="66"/>
       </w:tblBorders>
     </w:tblPr>
     <w:tblStylePr w:type="firstRow">
@@ -8169,7 +8504,7 @@
       <w:tblPr/>
       <w:tcPr>
         <w:tcBorders>
-          <w:bottom w:val="single" w:color="666666" w:themeColor="text1" w:themeTint="99" w:sz="12" w:space="0"/>
+          <w:bottom w:val="single" w:sz="12" w:space="0" w:color="666666" w:themeColor="text1" w:themeTint="99"/>
         </w:tcBorders>
       </w:tcPr>
     </w:tblStylePr>
@@ -8181,7 +8516,7 @@
       <w:tblPr/>
       <w:tcPr>
         <w:tcBorders>
-          <w:top w:val="double" w:color="666666" w:themeColor="text1" w:themeTint="99" w:sz="2" w:space="0"/>
+          <w:top w:val="double" w:sz="2" w:space="0" w:color="666666" w:themeColor="text1" w:themeTint="99"/>
         </w:tcBorders>
       </w:tcPr>
     </w:tblStylePr>
@@ -8242,7 +8577,7 @@
       <w:shd w:val="clear" w:color="auto" w:fill="E1DFDD"/>
     </w:rPr>
   </w:style>
-  <w:style w:type="paragraph" w:styleId="EndNoteBibliographyTitle" w:customStyle="1">
+  <w:style w:type="paragraph" w:customStyle="1" w:styleId="EndNoteBibliographyTitle">
     <w:name w:val="EndNote Bibliography Title"/>
     <w:basedOn w:val="Normal"/>
     <w:link w:val="EndNoteBibliographyTitleChar"/>
@@ -8256,7 +8591,7 @@
       <w:noProof/>
     </w:rPr>
   </w:style>
-  <w:style w:type="character" w:styleId="EndNoteBibliographyTitleChar" w:customStyle="1">
+  <w:style w:type="character" w:customStyle="1" w:styleId="EndNoteBibliographyTitleChar">
     <w:name w:val="EndNote Bibliography Title Char"/>
     <w:basedOn w:val="DefaultParagraphFont"/>
     <w:link w:val="EndNoteBibliographyTitle"/>
@@ -8266,7 +8601,7 @@
       <w:noProof/>
     </w:rPr>
   </w:style>
-  <w:style w:type="paragraph" w:styleId="EndNoteBibliography" w:customStyle="1">
+  <w:style w:type="paragraph" w:customStyle="1" w:styleId="EndNoteBibliography">
     <w:name w:val="EndNote Bibliography"/>
     <w:basedOn w:val="Normal"/>
     <w:link w:val="EndNoteBibliographyChar"/>
@@ -8276,7 +8611,7 @@
       <w:noProof/>
     </w:rPr>
   </w:style>
-  <w:style w:type="character" w:styleId="EndNoteBibliographyChar" w:customStyle="1">
+  <w:style w:type="character" w:customStyle="1" w:styleId="EndNoteBibliographyChar">
     <w:name w:val="EndNote Bibliography Char"/>
     <w:basedOn w:val="DefaultParagraphFont"/>
     <w:link w:val="EndNoteBibliography"/>
@@ -8321,7 +8656,7 @@
       <w:szCs w:val="25"/>
     </w:rPr>
   </w:style>
-  <w:style w:type="character" w:styleId="CommentTextChar" w:customStyle="1">
+  <w:style w:type="character" w:customStyle="1" w:styleId="CommentTextChar">
     <w:name w:val="Comment Text Char"/>
     <w:basedOn w:val="DefaultParagraphFont"/>
     <w:link w:val="CommentText"/>
@@ -8346,7 +8681,7 @@
       <w:bCs/>
     </w:rPr>
   </w:style>
-  <w:style w:type="character" w:styleId="CommentSubjectChar" w:customStyle="1">
+  <w:style w:type="character" w:customStyle="1" w:styleId="CommentSubjectChar">
     <w:name w:val="Comment Subject Char"/>
     <w:basedOn w:val="CommentTextChar"/>
     <w:link w:val="CommentSubject"/>
@@ -8360,12 +8695,12 @@
       <w:szCs w:val="25"/>
     </w:rPr>
   </w:style>
-  <w:style w:type="character" w:styleId="font-semibold" w:customStyle="1">
+  <w:style w:type="character" w:customStyle="1" w:styleId="font-semibold">
     <w:name w:val="font-semibold"/>
     <w:basedOn w:val="DefaultParagraphFont"/>
     <w:rsid w:val="00C72A72"/>
   </w:style>
-  <w:style w:type="paragraph" w:styleId="Caption1" w:customStyle="1">
+  <w:style w:type="paragraph" w:customStyle="1" w:styleId="Caption1">
     <w:name w:val="Caption1"/>
     <w:basedOn w:val="Normal"/>
     <w:next w:val="Normal"/>
@@ -8379,7 +8714,7 @@
       <w:sz w:val="20"/>
     </w:rPr>
   </w:style>
-  <w:style w:type="paragraph" w:styleId="ui-markdownlist-item" w:customStyle="1">
+  <w:style w:type="paragraph" w:customStyle="1" w:styleId="ui-markdownlist-item">
     <w:name w:val="ui-markdown__list-item"/>
     <w:basedOn w:val="Normal"/>
     <w:rsid w:val="000F4C7D"/>
@@ -8387,7 +8722,7 @@
       <w:spacing w:before="100" w:beforeAutospacing="1" w:after="100" w:afterAutospacing="1"/>
     </w:pPr>
     <w:rPr>
-      <w:rFonts w:ascii="Tahoma" w:hAnsi="Tahoma" w:eastAsia="Times New Roman" w:cs="Tahoma"/>
+      <w:rFonts w:ascii="Tahoma" w:eastAsia="Times New Roman" w:hAnsi="Tahoma" w:cs="Tahoma"/>
       <w:kern w:val="0"/>
       <w:sz w:val="24"/>
       <w:szCs w:val="24"/>
@@ -8714,15 +9049,20 @@
 </file>
 
 <file path=customXml/item1.xml><?xml version="1.0" encoding="utf-8"?>
-<?mso-contentType ?>
-<FormTemplates xmlns="http://schemas.microsoft.com/sharepoint/v3/contenttype/forms">
-  <Display>DocumentLibraryForm</Display>
-  <Edit>DocumentLibraryForm</Edit>
-  <New>DocumentLibraryForm</New>
-</FormTemplates>
+<p:properties xmlns:p="http://schemas.microsoft.com/office/2006/metadata/properties" xmlns:xsi="http://www.w3.org/2001/XMLSchema-instance" xmlns:pc="http://schemas.microsoft.com/office/infopath/2007/PartnerControls">
+  <documentManagement>
+    <_activity xmlns="3bacbb70-30ea-4fcf-9ace-74ef9998fbc3" xsi:nil="true"/>
+    <_ip_UnifiedCompliancePolicyUIAction xmlns="http://schemas.microsoft.com/sharepoint/v3" xsi:nil="true"/>
+    <_ip_UnifiedCompliancePolicyProperties xmlns="http://schemas.microsoft.com/sharepoint/v3" xsi:nil="true"/>
+  </documentManagement>
+</p:properties>
 </file>
 
 <file path=customXml/item2.xml><?xml version="1.0" encoding="utf-8"?>
+<b:Sources xmlns:b="http://schemas.openxmlformats.org/officeDocument/2006/bibliography" xmlns="http://schemas.openxmlformats.org/officeDocument/2006/bibliography" SelectedStyle="\APASixthEditionOfficeOnline.xsl" StyleName="APA" Version="6"/>
+</file>
+
+<file path=customXml/item3.xml><?xml version="1.0" encoding="utf-8"?>
 <ct:contentTypeSchema xmlns:ct="http://schemas.microsoft.com/office/2006/metadata/contentType" xmlns:ma="http://schemas.microsoft.com/office/2006/metadata/properties/metaAttributes" ct:_="" ma:_="" ma:contentTypeName="Document" ma:contentTypeID="0x0101001396B29C8D40334DAF66FC5284855424" ma:contentTypeVersion="7" ma:contentTypeDescription="Create a new document." ma:contentTypeScope="" ma:versionID="aab9185dd332be953207ce3da6540a4e">
   <xsd:schema xmlns:xsd="http://www.w3.org/2001/XMLSchema" xmlns:xs="http://www.w3.org/2001/XMLSchema" xmlns:p="http://schemas.microsoft.com/office/2006/metadata/properties" xmlns:ns1="http://schemas.microsoft.com/sharepoint/v3" xmlns:ns3="3bacbb70-30ea-4fcf-9ace-74ef9998fbc3" targetNamespace="http://schemas.microsoft.com/office/2006/metadata/properties" ma:root="true" ma:fieldsID="b0e47055c57bfae17f47e10e1209ad5f" ns1:_="" ns3:_="">
     <xsd:import namespace="http://schemas.microsoft.com/sharepoint/v3"/>
@@ -8889,29 +9229,35 @@
 </ct:contentTypeSchema>
 </file>
 
-<file path=customXml/item3.xml><?xml version="1.0" encoding="utf-8"?>
-<b:Sources xmlns:b="http://schemas.openxmlformats.org/officeDocument/2006/bibliography" xmlns="http://schemas.openxmlformats.org/officeDocument/2006/bibliography" SelectedStyle="\APASixthEditionOfficeOnline.xsl" StyleName="APA" Version="6"/>
-</file>
-
 <file path=customXml/item4.xml><?xml version="1.0" encoding="utf-8"?>
-<p:properties xmlns:p="http://schemas.microsoft.com/office/2006/metadata/properties" xmlns:xsi="http://www.w3.org/2001/XMLSchema-instance" xmlns:pc="http://schemas.microsoft.com/office/infopath/2007/PartnerControls">
-  <documentManagement>
-    <_activity xmlns="3bacbb70-30ea-4fcf-9ace-74ef9998fbc3" xsi:nil="true"/>
-    <_ip_UnifiedCompliancePolicyUIAction xmlns="http://schemas.microsoft.com/sharepoint/v3" xsi:nil="true"/>
-    <_ip_UnifiedCompliancePolicyProperties xmlns="http://schemas.microsoft.com/sharepoint/v3" xsi:nil="true"/>
-  </documentManagement>
-</p:properties>
+<?mso-contentType ?>
+<FormTemplates xmlns="http://schemas.microsoft.com/sharepoint/v3/contenttype/forms">
+  <Display>DocumentLibraryForm</Display>
+  <Edit>DocumentLibraryForm</Edit>
+  <New>DocumentLibraryForm</New>
+</FormTemplates>
 </file>
 
 <file path=customXml/itemProps1.xml><?xml version="1.0" encoding="utf-8"?>
-<ds:datastoreItem xmlns:ds="http://schemas.openxmlformats.org/officeDocument/2006/customXml" ds:itemID="{91D0AB4A-A7AE-4734-A4FD-BACA4532E615}">
+<ds:datastoreItem xmlns:ds="http://schemas.openxmlformats.org/officeDocument/2006/customXml" ds:itemID="{9512EBB9-CB3B-48CB-9C36-9496BEBF4CA8}">
   <ds:schemaRefs>
-    <ds:schemaRef ds:uri="http://schemas.microsoft.com/sharepoint/v3/contenttype/forms"/>
+    <ds:schemaRef ds:uri="http://schemas.microsoft.com/office/2006/metadata/properties"/>
+    <ds:schemaRef ds:uri="http://schemas.microsoft.com/office/infopath/2007/PartnerControls"/>
+    <ds:schemaRef ds:uri="3bacbb70-30ea-4fcf-9ace-74ef9998fbc3"/>
+    <ds:schemaRef ds:uri="http://schemas.microsoft.com/sharepoint/v3"/>
   </ds:schemaRefs>
 </ds:datastoreItem>
 </file>
 
 <file path=customXml/itemProps2.xml><?xml version="1.0" encoding="utf-8"?>
+<ds:datastoreItem xmlns:ds="http://schemas.openxmlformats.org/officeDocument/2006/customXml" ds:itemID="{71EE9DF3-706A-4C9A-B0D9-B6E87233B6AA}">
+  <ds:schemaRefs>
+    <ds:schemaRef ds:uri="http://schemas.openxmlformats.org/officeDocument/2006/bibliography"/>
+  </ds:schemaRefs>
+</ds:datastoreItem>
+</file>
+
+<file path=customXml/itemProps3.xml><?xml version="1.0" encoding="utf-8"?>
 <ds:datastoreItem xmlns:ds="http://schemas.openxmlformats.org/officeDocument/2006/customXml" ds:itemID="{E37E28BF-1B4B-4C6A-BC51-C0D1EF82259A}">
   <ds:schemaRefs>
     <ds:schemaRef ds:uri="http://schemas.microsoft.com/office/2006/metadata/contentType"/>
@@ -8930,21 +9276,10 @@
 </ds:datastoreItem>
 </file>
 
-<file path=customXml/itemProps3.xml><?xml version="1.0" encoding="utf-8"?>
-<ds:datastoreItem xmlns:ds="http://schemas.openxmlformats.org/officeDocument/2006/customXml" ds:itemID="{71EE9DF3-706A-4C9A-B0D9-B6E87233B6AA}">
+<file path=customXml/itemProps4.xml><?xml version="1.0" encoding="utf-8"?>
+<ds:datastoreItem xmlns:ds="http://schemas.openxmlformats.org/officeDocument/2006/customXml" ds:itemID="{91D0AB4A-A7AE-4734-A4FD-BACA4532E615}">
   <ds:schemaRefs>
-    <ds:schemaRef ds:uri="http://schemas.openxmlformats.org/officeDocument/2006/bibliography"/>
-  </ds:schemaRefs>
-</ds:datastoreItem>
-</file>
-
-<file path=customXml/itemProps4.xml><?xml version="1.0" encoding="utf-8"?>
-<ds:datastoreItem xmlns:ds="http://schemas.openxmlformats.org/officeDocument/2006/customXml" ds:itemID="{9512EBB9-CB3B-48CB-9C36-9496BEBF4CA8}">
-  <ds:schemaRefs>
-    <ds:schemaRef ds:uri="http://schemas.microsoft.com/office/2006/metadata/properties"/>
-    <ds:schemaRef ds:uri="http://schemas.microsoft.com/office/infopath/2007/PartnerControls"/>
-    <ds:schemaRef ds:uri="3bacbb70-30ea-4fcf-9ace-74ef9998fbc3"/>
-    <ds:schemaRef ds:uri="http://schemas.microsoft.com/sharepoint/v3"/>
+    <ds:schemaRef ds:uri="http://schemas.microsoft.com/sharepoint/v3/contenttype/forms"/>
   </ds:schemaRefs>
 </ds:datastoreItem>
 </file>
</xml_diff>